<commit_message>
oneiro: the daily work is not code, so the question is not shaped like a patch
An action proposal joins the change proposal on the same button path: what I found,
what I propose, what I need from you, and where the effect lands, with no branch
because nothing is being committed. Twenty tests, including the secretary case in the
paper: a letter about admission arrives, the lists are on the desktop, and the agent
asks before it writes a row into the register.

The paper's practical chapter now carries that morning, and the confidentiality rule
that goes with it: reading and sorting happen on the machine, only the question leaves.
</commit_message>
<xml_diff>
--- a/docs/pz/Пояснительная записка.docx
+++ b/docs/pz/Пояснительная записка.docx
@@ -149,7 +149,7 @@
         </w:rPr>
         <w:fldChar w:fldCharType="separate"/>
       </w:r>
-      <w:hyperlink w:anchor="_Toc240979870" w:history="1">
+      <w:hyperlink w:anchor="_Toc240988195" w:history="1">
         <w:r>
           <w:rPr>
             <w:rStyle w:val="aff8"/>
@@ -177,7 +177,7 @@
             <w:noProof/>
             <w:webHidden/>
           </w:rPr>
-          <w:instrText xml:space="preserve"> PAGEREF _Toc240979870 \h </w:instrText>
+          <w:instrText xml:space="preserve"> PAGEREF _Toc240988195 \h </w:instrText>
         </w:r>
         <w:r>
           <w:rPr>
@@ -222,7 +222,7 @@
           <w:lang w:val="ru-RU" w:eastAsia="ru-RU"/>
         </w:rPr>
       </w:pPr>
-      <w:hyperlink w:anchor="_Toc240979871" w:history="1">
+      <w:hyperlink w:anchor="_Toc240988196" w:history="1">
         <w:r>
           <w:rPr>
             <w:rStyle w:val="aff8"/>
@@ -250,7 +250,7 @@
             <w:noProof/>
             <w:webHidden/>
           </w:rPr>
-          <w:instrText xml:space="preserve"> PAGEREF _Toc240979871 \h </w:instrText>
+          <w:instrText xml:space="preserve"> PAGEREF _Toc240988196 \h </w:instrText>
         </w:r>
         <w:r>
           <w:rPr>
@@ -295,7 +295,7 @@
           <w:lang w:val="ru-RU" w:eastAsia="ru-RU"/>
         </w:rPr>
       </w:pPr>
-      <w:hyperlink w:anchor="_Toc240979872" w:history="1">
+      <w:hyperlink w:anchor="_Toc240988197" w:history="1">
         <w:r>
           <w:rPr>
             <w:rStyle w:val="aff8"/>
@@ -323,7 +323,7 @@
             <w:noProof/>
             <w:webHidden/>
           </w:rPr>
-          <w:instrText xml:space="preserve"> PAGEREF _Toc240979872 \h </w:instrText>
+          <w:instrText xml:space="preserve"> PAGEREF _Toc240988197 \h </w:instrText>
         </w:r>
         <w:r>
           <w:rPr>
@@ -368,7 +368,7 @@
           <w:lang w:val="ru-RU" w:eastAsia="ru-RU"/>
         </w:rPr>
       </w:pPr>
-      <w:hyperlink w:anchor="_Toc240979873" w:history="1">
+      <w:hyperlink w:anchor="_Toc240988198" w:history="1">
         <w:r>
           <w:rPr>
             <w:rStyle w:val="aff8"/>
@@ -396,7 +396,7 @@
             <w:noProof/>
             <w:webHidden/>
           </w:rPr>
-          <w:instrText xml:space="preserve"> PAGEREF _Toc240979873 \h </w:instrText>
+          <w:instrText xml:space="preserve"> PAGEREF _Toc240988198 \h </w:instrText>
         </w:r>
         <w:r>
           <w:rPr>
@@ -441,7 +441,7 @@
           <w:lang w:val="ru-RU" w:eastAsia="ru-RU"/>
         </w:rPr>
       </w:pPr>
-      <w:hyperlink w:anchor="_Toc240979874" w:history="1">
+      <w:hyperlink w:anchor="_Toc240988199" w:history="1">
         <w:r>
           <w:rPr>
             <w:rStyle w:val="aff8"/>
@@ -469,7 +469,7 @@
             <w:noProof/>
             <w:webHidden/>
           </w:rPr>
-          <w:instrText xml:space="preserve"> PAGEREF _Toc240979874 \h </w:instrText>
+          <w:instrText xml:space="preserve"> PAGEREF _Toc240988199 \h </w:instrText>
         </w:r>
         <w:r>
           <w:rPr>
@@ -514,7 +514,7 @@
           <w:lang w:val="ru-RU" w:eastAsia="ru-RU"/>
         </w:rPr>
       </w:pPr>
-      <w:hyperlink w:anchor="_Toc240979875" w:history="1">
+      <w:hyperlink w:anchor="_Toc240988200" w:history="1">
         <w:r>
           <w:rPr>
             <w:rStyle w:val="aff8"/>
@@ -542,7 +542,7 @@
             <w:noProof/>
             <w:webHidden/>
           </w:rPr>
-          <w:instrText xml:space="preserve"> PAGEREF _Toc240979875 \h </w:instrText>
+          <w:instrText xml:space="preserve"> PAGEREF _Toc240988200 \h </w:instrText>
         </w:r>
         <w:r>
           <w:rPr>
@@ -587,7 +587,7 @@
           <w:lang w:val="ru-RU" w:eastAsia="ru-RU"/>
         </w:rPr>
       </w:pPr>
-      <w:hyperlink w:anchor="_Toc240979876" w:history="1">
+      <w:hyperlink w:anchor="_Toc240988201" w:history="1">
         <w:r>
           <w:rPr>
             <w:rStyle w:val="aff8"/>
@@ -615,7 +615,7 @@
             <w:noProof/>
             <w:webHidden/>
           </w:rPr>
-          <w:instrText xml:space="preserve"> PAGEREF _Toc240979876 \h </w:instrText>
+          <w:instrText xml:space="preserve"> PAGEREF _Toc240988201 \h </w:instrText>
         </w:r>
         <w:r>
           <w:rPr>
@@ -660,7 +660,7 @@
           <w:lang w:val="ru-RU" w:eastAsia="ru-RU"/>
         </w:rPr>
       </w:pPr>
-      <w:hyperlink w:anchor="_Toc240979877" w:history="1">
+      <w:hyperlink w:anchor="_Toc240988202" w:history="1">
         <w:r>
           <w:rPr>
             <w:rStyle w:val="aff8"/>
@@ -688,7 +688,7 @@
             <w:noProof/>
             <w:webHidden/>
           </w:rPr>
-          <w:instrText xml:space="preserve"> PAGEREF _Toc240979877 \h </w:instrText>
+          <w:instrText xml:space="preserve"> PAGEREF _Toc240988202 \h </w:instrText>
         </w:r>
         <w:r>
           <w:rPr>
@@ -733,7 +733,7 @@
           <w:lang w:val="ru-RU" w:eastAsia="ru-RU"/>
         </w:rPr>
       </w:pPr>
-      <w:hyperlink w:anchor="_Toc240979878" w:history="1">
+      <w:hyperlink w:anchor="_Toc240988203" w:history="1">
         <w:r>
           <w:rPr>
             <w:rStyle w:val="aff8"/>
@@ -761,7 +761,7 @@
             <w:noProof/>
             <w:webHidden/>
           </w:rPr>
-          <w:instrText xml:space="preserve"> PAGEREF _Toc240979878 \h </w:instrText>
+          <w:instrText xml:space="preserve"> PAGEREF _Toc240988203 \h </w:instrText>
         </w:r>
         <w:r>
           <w:rPr>
@@ -806,7 +806,7 @@
           <w:lang w:val="ru-RU" w:eastAsia="ru-RU"/>
         </w:rPr>
       </w:pPr>
-      <w:hyperlink w:anchor="_Toc240979879" w:history="1">
+      <w:hyperlink w:anchor="_Toc240988204" w:history="1">
         <w:r>
           <w:rPr>
             <w:rStyle w:val="aff8"/>
@@ -834,7 +834,7 @@
             <w:noProof/>
             <w:webHidden/>
           </w:rPr>
-          <w:instrText xml:space="preserve"> PAGEREF _Toc240979879 \h </w:instrText>
+          <w:instrText xml:space="preserve"> PAGEREF _Toc240988204 \h </w:instrText>
         </w:r>
         <w:r>
           <w:rPr>
@@ -879,7 +879,7 @@
           <w:lang w:val="ru-RU" w:eastAsia="ru-RU"/>
         </w:rPr>
       </w:pPr>
-      <w:hyperlink w:anchor="_Toc240979880" w:history="1">
+      <w:hyperlink w:anchor="_Toc240988205" w:history="1">
         <w:r>
           <w:rPr>
             <w:rStyle w:val="aff8"/>
@@ -907,7 +907,7 @@
             <w:noProof/>
             <w:webHidden/>
           </w:rPr>
-          <w:instrText xml:space="preserve"> PAGEREF _Toc240979880 \h </w:instrText>
+          <w:instrText xml:space="preserve"> PAGEREF _Toc240988205 \h </w:instrText>
         </w:r>
         <w:r>
           <w:rPr>
@@ -952,7 +952,7 @@
           <w:lang w:val="ru-RU" w:eastAsia="ru-RU"/>
         </w:rPr>
       </w:pPr>
-      <w:hyperlink w:anchor="_Toc240979881" w:history="1">
+      <w:hyperlink w:anchor="_Toc240988206" w:history="1">
         <w:r>
           <w:rPr>
             <w:rStyle w:val="aff8"/>
@@ -980,7 +980,7 @@
             <w:noProof/>
             <w:webHidden/>
           </w:rPr>
-          <w:instrText xml:space="preserve"> PAGEREF _Toc240979881 \h </w:instrText>
+          <w:instrText xml:space="preserve"> PAGEREF _Toc240988206 \h </w:instrText>
         </w:r>
         <w:r>
           <w:rPr>
@@ -1025,7 +1025,7 @@
           <w:lang w:val="ru-RU" w:eastAsia="ru-RU"/>
         </w:rPr>
       </w:pPr>
-      <w:hyperlink w:anchor="_Toc240979882" w:history="1">
+      <w:hyperlink w:anchor="_Toc240988207" w:history="1">
         <w:r>
           <w:rPr>
             <w:rStyle w:val="aff8"/>
@@ -1053,7 +1053,7 @@
             <w:noProof/>
             <w:webHidden/>
           </w:rPr>
-          <w:instrText xml:space="preserve"> PAGEREF _Toc240979882 \h </w:instrText>
+          <w:instrText xml:space="preserve"> PAGEREF _Toc240988207 \h </w:instrText>
         </w:r>
         <w:r>
           <w:rPr>
@@ -1098,7 +1098,7 @@
           <w:lang w:val="ru-RU" w:eastAsia="ru-RU"/>
         </w:rPr>
       </w:pPr>
-      <w:hyperlink w:anchor="_Toc240979883" w:history="1">
+      <w:hyperlink w:anchor="_Toc240988208" w:history="1">
         <w:r>
           <w:rPr>
             <w:rStyle w:val="aff8"/>
@@ -1126,7 +1126,7 @@
             <w:noProof/>
             <w:webHidden/>
           </w:rPr>
-          <w:instrText xml:space="preserve"> PAGEREF _Toc240979883 \h </w:instrText>
+          <w:instrText xml:space="preserve"> PAGEREF _Toc240988208 \h </w:instrText>
         </w:r>
         <w:r>
           <w:rPr>
@@ -1171,7 +1171,7 @@
           <w:lang w:val="ru-RU" w:eastAsia="ru-RU"/>
         </w:rPr>
       </w:pPr>
-      <w:hyperlink w:anchor="_Toc240979884" w:history="1">
+      <w:hyperlink w:anchor="_Toc240988209" w:history="1">
         <w:r>
           <w:rPr>
             <w:rStyle w:val="aff8"/>
@@ -1199,7 +1199,7 @@
             <w:noProof/>
             <w:webHidden/>
           </w:rPr>
-          <w:instrText xml:space="preserve"> PAGEREF _Toc240979884 \h </w:instrText>
+          <w:instrText xml:space="preserve"> PAGEREF _Toc240988209 \h </w:instrText>
         </w:r>
         <w:r>
           <w:rPr>
@@ -1244,7 +1244,7 @@
           <w:lang w:val="ru-RU" w:eastAsia="ru-RU"/>
         </w:rPr>
       </w:pPr>
-      <w:hyperlink w:anchor="_Toc240979885" w:history="1">
+      <w:hyperlink w:anchor="_Toc240988210" w:history="1">
         <w:r>
           <w:rPr>
             <w:rStyle w:val="aff8"/>
@@ -1272,7 +1272,7 @@
             <w:noProof/>
             <w:webHidden/>
           </w:rPr>
-          <w:instrText xml:space="preserve"> PAGEREF _Toc240979885 \h </w:instrText>
+          <w:instrText xml:space="preserve"> PAGEREF _Toc240988210 \h </w:instrText>
         </w:r>
         <w:r>
           <w:rPr>
@@ -1317,7 +1317,7 @@
           <w:lang w:val="ru-RU" w:eastAsia="ru-RU"/>
         </w:rPr>
       </w:pPr>
-      <w:hyperlink w:anchor="_Toc240979886" w:history="1">
+      <w:hyperlink w:anchor="_Toc240988211" w:history="1">
         <w:r>
           <w:rPr>
             <w:rStyle w:val="aff8"/>
@@ -1345,7 +1345,7 @@
             <w:noProof/>
             <w:webHidden/>
           </w:rPr>
-          <w:instrText xml:space="preserve"> PAGEREF _Toc240979886 \h </w:instrText>
+          <w:instrText xml:space="preserve"> PAGEREF _Toc240988211 \h </w:instrText>
         </w:r>
         <w:r>
           <w:rPr>
@@ -1390,7 +1390,7 @@
           <w:lang w:val="ru-RU" w:eastAsia="ru-RU"/>
         </w:rPr>
       </w:pPr>
-      <w:hyperlink w:anchor="_Toc240979887" w:history="1">
+      <w:hyperlink w:anchor="_Toc240988212" w:history="1">
         <w:r>
           <w:rPr>
             <w:rStyle w:val="aff8"/>
@@ -1418,7 +1418,7 @@
             <w:noProof/>
             <w:webHidden/>
           </w:rPr>
-          <w:instrText xml:space="preserve"> PAGEREF _Toc240979887 \h </w:instrText>
+          <w:instrText xml:space="preserve"> PAGEREF _Toc240988212 \h </w:instrText>
         </w:r>
         <w:r>
           <w:rPr>
@@ -1438,7 +1438,7 @@
             <w:noProof/>
             <w:webHidden/>
           </w:rPr>
-          <w:t>12</w:t>
+          <w:t>13</w:t>
         </w:r>
         <w:r>
           <w:rPr>
@@ -1463,7 +1463,7 @@
           <w:lang w:val="ru-RU" w:eastAsia="ru-RU"/>
         </w:rPr>
       </w:pPr>
-      <w:hyperlink w:anchor="_Toc240979888" w:history="1">
+      <w:hyperlink w:anchor="_Toc240988213" w:history="1">
         <w:r>
           <w:rPr>
             <w:rStyle w:val="aff8"/>
@@ -1491,7 +1491,7 @@
             <w:noProof/>
             <w:webHidden/>
           </w:rPr>
-          <w:instrText xml:space="preserve"> PAGEREF _Toc240979888 \h </w:instrText>
+          <w:instrText xml:space="preserve"> PAGEREF _Toc240988213 \h </w:instrText>
         </w:r>
         <w:r>
           <w:rPr>
@@ -1536,7 +1536,7 @@
           <w:lang w:val="ru-RU" w:eastAsia="ru-RU"/>
         </w:rPr>
       </w:pPr>
-      <w:hyperlink w:anchor="_Toc240979889" w:history="1">
+      <w:hyperlink w:anchor="_Toc240988214" w:history="1">
         <w:r>
           <w:rPr>
             <w:rStyle w:val="aff8"/>
@@ -1564,7 +1564,7 @@
             <w:noProof/>
             <w:webHidden/>
           </w:rPr>
-          <w:instrText xml:space="preserve"> PAGEREF _Toc240979889 \h </w:instrText>
+          <w:instrText xml:space="preserve"> PAGEREF _Toc240988214 \h </w:instrText>
         </w:r>
         <w:r>
           <w:rPr>
@@ -1609,7 +1609,7 @@
           <w:lang w:val="ru-RU" w:eastAsia="ru-RU"/>
         </w:rPr>
       </w:pPr>
-      <w:hyperlink w:anchor="_Toc240979890" w:history="1">
+      <w:hyperlink w:anchor="_Toc240988215" w:history="1">
         <w:r>
           <w:rPr>
             <w:rStyle w:val="aff8"/>
@@ -1637,7 +1637,7 @@
             <w:noProof/>
             <w:webHidden/>
           </w:rPr>
-          <w:instrText xml:space="preserve"> PAGEREF _Toc240979890 \h </w:instrText>
+          <w:instrText xml:space="preserve"> PAGEREF _Toc240988215 \h </w:instrText>
         </w:r>
         <w:r>
           <w:rPr>
@@ -1682,7 +1682,7 @@
           <w:lang w:val="ru-RU" w:eastAsia="ru-RU"/>
         </w:rPr>
       </w:pPr>
-      <w:hyperlink w:anchor="_Toc240979891" w:history="1">
+      <w:hyperlink w:anchor="_Toc240988216" w:history="1">
         <w:r>
           <w:rPr>
             <w:rStyle w:val="aff8"/>
@@ -1710,7 +1710,7 @@
             <w:noProof/>
             <w:webHidden/>
           </w:rPr>
-          <w:instrText xml:space="preserve"> PAGEREF _Toc240979891 \h </w:instrText>
+          <w:instrText xml:space="preserve"> PAGEREF _Toc240988216 \h </w:instrText>
         </w:r>
         <w:r>
           <w:rPr>
@@ -1730,7 +1730,7 @@
             <w:noProof/>
             <w:webHidden/>
           </w:rPr>
-          <w:t>14</w:t>
+          <w:t>15</w:t>
         </w:r>
         <w:r>
           <w:rPr>
@@ -1755,7 +1755,7 @@
           <w:lang w:val="ru-RU" w:eastAsia="ru-RU"/>
         </w:rPr>
       </w:pPr>
-      <w:hyperlink w:anchor="_Toc240979892" w:history="1">
+      <w:hyperlink w:anchor="_Toc240988217" w:history="1">
         <w:r>
           <w:rPr>
             <w:rStyle w:val="aff8"/>
@@ -1783,7 +1783,7 @@
             <w:noProof/>
             <w:webHidden/>
           </w:rPr>
-          <w:instrText xml:space="preserve"> PAGEREF _Toc240979892 \h </w:instrText>
+          <w:instrText xml:space="preserve"> PAGEREF _Toc240988217 \h </w:instrText>
         </w:r>
         <w:r>
           <w:rPr>
@@ -1803,7 +1803,7 @@
             <w:noProof/>
             <w:webHidden/>
           </w:rPr>
-          <w:t>15</w:t>
+          <w:t>16</w:t>
         </w:r>
         <w:r>
           <w:rPr>
@@ -1828,7 +1828,7 @@
           <w:lang w:val="ru-RU" w:eastAsia="ru-RU"/>
         </w:rPr>
       </w:pPr>
-      <w:hyperlink w:anchor="_Toc240979893" w:history="1">
+      <w:hyperlink w:anchor="_Toc240988218" w:history="1">
         <w:r>
           <w:rPr>
             <w:rStyle w:val="aff8"/>
@@ -1856,7 +1856,7 @@
             <w:noProof/>
             <w:webHidden/>
           </w:rPr>
-          <w:instrText xml:space="preserve"> PAGEREF _Toc240979893 \h </w:instrText>
+          <w:instrText xml:space="preserve"> PAGEREF _Toc240988218 \h </w:instrText>
         </w:r>
         <w:r>
           <w:rPr>
@@ -1876,7 +1876,7 @@
             <w:noProof/>
             <w:webHidden/>
           </w:rPr>
-          <w:t>16</w:t>
+          <w:t>17</w:t>
         </w:r>
         <w:r>
           <w:rPr>
@@ -1901,7 +1901,7 @@
           <w:lang w:val="ru-RU" w:eastAsia="ru-RU"/>
         </w:rPr>
       </w:pPr>
-      <w:hyperlink w:anchor="_Toc240979894" w:history="1">
+      <w:hyperlink w:anchor="_Toc240988219" w:history="1">
         <w:r>
           <w:rPr>
             <w:rStyle w:val="aff8"/>
@@ -1929,7 +1929,7 @@
             <w:noProof/>
             <w:webHidden/>
           </w:rPr>
-          <w:instrText xml:space="preserve"> PAGEREF _Toc240979894 \h </w:instrText>
+          <w:instrText xml:space="preserve"> PAGEREF _Toc240988219 \h </w:instrText>
         </w:r>
         <w:r>
           <w:rPr>
@@ -1974,7 +1974,7 @@
           <w:lang w:val="ru-RU" w:eastAsia="ru-RU"/>
         </w:rPr>
       </w:pPr>
-      <w:hyperlink w:anchor="_Toc240979895" w:history="1">
+      <w:hyperlink w:anchor="_Toc240988220" w:history="1">
         <w:r>
           <w:rPr>
             <w:rStyle w:val="aff8"/>
@@ -2002,7 +2002,7 @@
             <w:noProof/>
             <w:webHidden/>
           </w:rPr>
-          <w:instrText xml:space="preserve"> PAGEREF _Toc240979895 \h </w:instrText>
+          <w:instrText xml:space="preserve"> PAGEREF _Toc240988220 \h </w:instrText>
         </w:r>
         <w:r>
           <w:rPr>
@@ -2022,7 +2022,7 @@
             <w:noProof/>
             <w:webHidden/>
           </w:rPr>
-          <w:t>18</w:t>
+          <w:t>19</w:t>
         </w:r>
         <w:r>
           <w:rPr>
@@ -2047,7 +2047,7 @@
           <w:lang w:val="ru-RU" w:eastAsia="ru-RU"/>
         </w:rPr>
       </w:pPr>
-      <w:hyperlink w:anchor="_Toc240979896" w:history="1">
+      <w:hyperlink w:anchor="_Toc240988221" w:history="1">
         <w:r>
           <w:rPr>
             <w:rStyle w:val="aff8"/>
@@ -2075,7 +2075,7 @@
             <w:noProof/>
             <w:webHidden/>
           </w:rPr>
-          <w:instrText xml:space="preserve"> PAGEREF _Toc240979896 \h </w:instrText>
+          <w:instrText xml:space="preserve"> PAGEREF _Toc240988221 \h </w:instrText>
         </w:r>
         <w:r>
           <w:rPr>
@@ -2120,7 +2120,7 @@
           <w:lang w:val="ru-RU" w:eastAsia="ru-RU"/>
         </w:rPr>
       </w:pPr>
-      <w:hyperlink w:anchor="_Toc240979897" w:history="1">
+      <w:hyperlink w:anchor="_Toc240988222" w:history="1">
         <w:r>
           <w:rPr>
             <w:rStyle w:val="aff8"/>
@@ -2148,7 +2148,7 @@
             <w:noProof/>
             <w:webHidden/>
           </w:rPr>
-          <w:instrText xml:space="preserve"> PAGEREF _Toc240979897 \h </w:instrText>
+          <w:instrText xml:space="preserve"> PAGEREF _Toc240988222 \h </w:instrText>
         </w:r>
         <w:r>
           <w:rPr>
@@ -2193,7 +2193,7 @@
           <w:lang w:val="ru-RU" w:eastAsia="ru-RU"/>
         </w:rPr>
       </w:pPr>
-      <w:hyperlink w:anchor="_Toc240979898" w:history="1">
+      <w:hyperlink w:anchor="_Toc240988223" w:history="1">
         <w:r>
           <w:rPr>
             <w:rStyle w:val="aff8"/>
@@ -2221,7 +2221,7 @@
             <w:noProof/>
             <w:webHidden/>
           </w:rPr>
-          <w:instrText xml:space="preserve"> PAGEREF _Toc240979898 \h </w:instrText>
+          <w:instrText xml:space="preserve"> PAGEREF _Toc240988223 \h </w:instrText>
         </w:r>
         <w:r>
           <w:rPr>
@@ -2266,7 +2266,7 @@
           <w:lang w:val="ru-RU" w:eastAsia="ru-RU"/>
         </w:rPr>
       </w:pPr>
-      <w:hyperlink w:anchor="_Toc240979899" w:history="1">
+      <w:hyperlink w:anchor="_Toc240988224" w:history="1">
         <w:r>
           <w:rPr>
             <w:rStyle w:val="aff8"/>
@@ -2294,7 +2294,7 @@
             <w:noProof/>
             <w:webHidden/>
           </w:rPr>
-          <w:instrText xml:space="preserve"> PAGEREF _Toc240979899 \h </w:instrText>
+          <w:instrText xml:space="preserve"> PAGEREF _Toc240988224 \h </w:instrText>
         </w:r>
         <w:r>
           <w:rPr>
@@ -2352,7 +2352,7 @@
       <w:pPr>
         <w:pStyle w:val="1"/>
       </w:pPr>
-      <w:bookmarkStart w:id="1" w:name="_Toc240979870"/>
+      <w:bookmarkStart w:id="1" w:name="_Toc240988195"/>
       <w:r>
         <w:rPr>
           <w:rFonts w:ascii="Times New Roman" w:hAnsi="Times New Roman"/>
@@ -2553,7 +2553,7 @@
       <w:pPr>
         <w:pStyle w:val="1"/>
       </w:pPr>
-      <w:bookmarkStart w:id="2" w:name="_Toc240979871"/>
+      <w:bookmarkStart w:id="2" w:name="_Toc240988196"/>
       <w:r>
         <w:rPr>
           <w:rFonts w:ascii="Times New Roman" w:hAnsi="Times New Roman"/>
@@ -2572,7 +2572,7 @@
       <w:pPr>
         <w:pStyle w:val="21"/>
       </w:pPr>
-      <w:bookmarkStart w:id="3" w:name="_Toc240979872"/>
+      <w:bookmarkStart w:id="3" w:name="_Toc240988197"/>
       <w:r>
         <w:rPr>
           <w:rFonts w:ascii="Times New Roman" w:hAnsi="Times New Roman"/>
@@ -2613,7 +2613,7 @@
       <w:pPr>
         <w:pStyle w:val="21"/>
       </w:pPr>
-      <w:bookmarkStart w:id="4" w:name="_Toc240979873"/>
+      <w:bookmarkStart w:id="4" w:name="_Toc240988198"/>
       <w:r>
         <w:rPr>
           <w:rFonts w:ascii="Times New Roman" w:hAnsi="Times New Roman"/>
@@ -2700,7 +2700,7 @@
       <w:pPr>
         <w:pStyle w:val="21"/>
       </w:pPr>
-      <w:bookmarkStart w:id="5" w:name="_Toc240979874"/>
+      <w:bookmarkStart w:id="5" w:name="_Toc240988199"/>
       <w:r>
         <w:rPr>
           <w:rFonts w:ascii="Times New Roman" w:hAnsi="Times New Roman"/>
@@ -2724,7 +2724,7 @@
       <w:pPr>
         <w:pStyle w:val="21"/>
       </w:pPr>
-      <w:bookmarkStart w:id="6" w:name="_Toc240979875"/>
+      <w:bookmarkStart w:id="6" w:name="_Toc240988200"/>
       <w:r>
         <w:rPr>
           <w:rFonts w:ascii="Times New Roman" w:hAnsi="Times New Roman"/>
@@ -2755,7 +2755,7 @@
       <w:pPr>
         <w:pStyle w:val="21"/>
       </w:pPr>
-      <w:bookmarkStart w:id="7" w:name="_Toc240979876"/>
+      <w:bookmarkStart w:id="7" w:name="_Toc240988201"/>
       <w:r>
         <w:rPr>
           <w:rFonts w:ascii="Times New Roman" w:hAnsi="Times New Roman"/>
@@ -2790,7 +2790,7 @@
       <w:pPr>
         <w:pStyle w:val="1"/>
       </w:pPr>
-      <w:bookmarkStart w:id="8" w:name="_Toc240979877"/>
+      <w:bookmarkStart w:id="8" w:name="_Toc240988202"/>
       <w:r>
         <w:rPr>
           <w:rFonts w:ascii="Times New Roman" w:hAnsi="Times New Roman"/>
@@ -2803,7 +2803,7 @@
       <w:pPr>
         <w:pStyle w:val="21"/>
       </w:pPr>
-      <w:bookmarkStart w:id="9" w:name="_Toc240979878"/>
+      <w:bookmarkStart w:id="9" w:name="_Toc240988203"/>
       <w:r>
         <w:rPr>
           <w:rFonts w:ascii="Times New Roman" w:hAnsi="Times New Roman"/>
@@ -2882,7 +2882,7 @@
       <w:pPr>
         <w:pStyle w:val="21"/>
       </w:pPr>
-      <w:bookmarkStart w:id="10" w:name="_Toc240979879"/>
+      <w:bookmarkStart w:id="10" w:name="_Toc240988204"/>
       <w:r>
         <w:rPr>
           <w:rFonts w:ascii="Times New Roman" w:hAnsi="Times New Roman"/>
@@ -2926,7 +2926,7 @@
       <w:pPr>
         <w:pStyle w:val="21"/>
       </w:pPr>
-      <w:bookmarkStart w:id="11" w:name="_Toc240979880"/>
+      <w:bookmarkStart w:id="11" w:name="_Toc240988205"/>
       <w:r>
         <w:rPr>
           <w:rFonts w:ascii="Times New Roman" w:hAnsi="Times New Roman"/>
@@ -2958,7 +2958,7 @@
       <w:pPr>
         <w:pStyle w:val="21"/>
       </w:pPr>
-      <w:bookmarkStart w:id="12" w:name="_Toc240979881"/>
+      <w:bookmarkStart w:id="12" w:name="_Toc240988206"/>
       <w:r>
         <w:rPr>
           <w:rFonts w:ascii="Times New Roman" w:hAnsi="Times New Roman"/>
@@ -2997,7 +2997,7 @@
       <w:pPr>
         <w:pStyle w:val="21"/>
       </w:pPr>
-      <w:bookmarkStart w:id="13" w:name="_Toc240979882"/>
+      <w:bookmarkStart w:id="13" w:name="_Toc240988207"/>
       <w:r>
         <w:rPr>
           <w:rFonts w:ascii="Times New Roman" w:hAnsi="Times New Roman"/>
@@ -3034,7 +3034,7 @@
       <w:pPr>
         <w:pStyle w:val="1"/>
       </w:pPr>
-      <w:bookmarkStart w:id="14" w:name="_Toc240979883"/>
+      <w:bookmarkStart w:id="14" w:name="_Toc240988208"/>
       <w:r>
         <w:rPr>
           <w:rFonts w:ascii="Times New Roman" w:hAnsi="Times New Roman"/>
@@ -3047,7 +3047,7 @@
       <w:pPr>
         <w:pStyle w:val="21"/>
       </w:pPr>
-      <w:bookmarkStart w:id="15" w:name="_Toc240979884"/>
+      <w:bookmarkStart w:id="15" w:name="_Toc240988209"/>
       <w:r>
         <w:rPr>
           <w:rFonts w:ascii="Times New Roman" w:hAnsi="Times New Roman"/>
@@ -3119,7 +3119,7 @@
       <w:pPr>
         <w:pStyle w:val="21"/>
       </w:pPr>
-      <w:bookmarkStart w:id="16" w:name="_Toc240979885"/>
+      <w:bookmarkStart w:id="16" w:name="_Toc240988210"/>
       <w:r>
         <w:rPr>
           <w:rFonts w:ascii="Times New Roman" w:hAnsi="Times New Roman"/>
@@ -3217,7 +3217,7 @@
       <w:pPr>
         <w:pStyle w:val="21"/>
       </w:pPr>
-      <w:bookmarkStart w:id="17" w:name="_Toc240979886"/>
+      <w:bookmarkStart w:id="17" w:name="_Toc240988211"/>
       <w:r>
         <w:rPr>
           <w:rFonts w:ascii="Times New Roman" w:hAnsi="Times New Roman"/>
@@ -3461,53 +3461,75 @@
     <w:p/>
     <w:p>
       <w:r>
-        <w:t xml:space="preserve">Почему это не делает обычный чат с языковой моделью: здесь важна не удачная формулировка, а ведение потока неделями. Нужно помнить, что было в прошлый раз, кто что обещал, какой срок подходит, что уже отправлено. Результат определяют память и </w:t>
-      </w:r>
-      <w:r>
-        <w:t>длительность, а не красноречие. Доступ к данным выставляет человек: помощник видит только то, что ему открыли, а отправка наружу (письмо, сообщение в мессенджер, файл) остаётся за человеком до тех пор, пока он сам не разрешит обратное.</w:t>
+        <w:t>Разбор одного утра. На рабочую почту приходит письмо о приёме учащихся в десятый класс. Помощник читает письмо, находит на рабочем столе уже лежащие там списки и присылает в мессенджер одну строку: письмо о приёме, списки найдены рядом, вносит</w:t>
+      </w:r>
+      <w:r>
+        <w:t>ь ли три фамилии в базу приёма. Дальше он ждёт ответа. Запись в базу происходит не потому, что модель так решила, а потому, что человек нажал кнопку: нажатие и есть решение, оно делается один раз и остаётся в журнале вместе с тем, что именно изменено. У во</w:t>
+      </w:r>
+      <w:r>
+        <w:t>проса есть только две кнопки, принять и отклонить, и между ними нет третьего пути, поэтому помощник не может выписать себе разрешение сам, ни текстом, ни своим ответом.</w:t>
+      </w:r>
+    </w:p>
+    <w:p>
+      <w:r>
+        <w:t>Второе, что решает этот сценарий, это где остаются данные. Чтение почты, разбор вложени</w:t>
+      </w:r>
+      <w:r>
+        <w:t xml:space="preserve">й и работа со списками выполняются на самой машине, а наружу уходит только вопрос и только тому человеку, которому он адресован. </w:t>
+      </w:r>
+      <w:r>
+        <w:lastRenderedPageBreak/>
+        <w:t>Списки, оценки и переписка не покидают рабочее место; наружу выходит лишь то, что человек сам разрешил отправить. Такое разделе</w:t>
+      </w:r>
+      <w:r>
+        <w:t>ние принципиально для школы и офиса: помощник получает ровно тот доступ, который ему открыли, а не весь компьютер целиком.</w:t>
+      </w:r>
+    </w:p>
+    <w:p>
+      <w:r>
+        <w:t>Почему это не делает обычный чат с языковой моделью: здесь важна не удачная формулировка, а ведение потока неделями. Нужно помнить, ч</w:t>
+      </w:r>
+      <w:r>
+        <w:t>то было в прошлый раз, кто что обещал, какой срок подходит, что уже отправлено. Результат определяют память и длительность, а не красноречие. Доступ к данным выставляет человек: помощник видит только то, что ему открыли, а отправка наружу (письмо, сообщени</w:t>
+      </w:r>
+      <w:r>
+        <w:t>е в мессенджер, файл) остаётся за человеком до тех пор, пока он сам не разрешит обратное.</w:t>
       </w:r>
     </w:p>
     <w:p>
       <w:pPr>
         <w:pStyle w:val="21"/>
       </w:pPr>
-      <w:bookmarkStart w:id="18" w:name="_Toc240979887"/>
+      <w:bookmarkStart w:id="18" w:name="_Toc240988212"/>
       <w:r>
         <w:rPr>
           <w:rFonts w:ascii="Times New Roman" w:hAnsi="Times New Roman"/>
         </w:rPr>
-        <w:t>3.4. Что нужно для з</w:t>
-      </w:r>
-      <w:r>
-        <w:rPr>
-          <w:rFonts w:ascii="Times New Roman" w:hAnsi="Times New Roman"/>
-        </w:rPr>
-        <w:t>апуска</w:t>
+        <w:t>3.4. Что нужно для запуска</w:t>
       </w:r>
       <w:bookmarkEnd w:id="18"/>
     </w:p>
     <w:p>
       <w:r>
-        <w:t>Требования к машине скромные: интерпретатор Python, локальный стек графа знаний в контейнере, доступ к языковым моделям через локальный прокси с ключами. Панель управления поднимается одним процессом на локальном порту, и вся работа видна в браузере</w:t>
-      </w:r>
-      <w:r>
-        <w:t xml:space="preserve"> на той же машине.</w:t>
+        <w:t xml:space="preserve">Требования к машине скромные: интерпретатор Python, локальный стек графа знаний в контейнере, доступ к языковым моделям через локальный </w:t>
+      </w:r>
+      <w:r>
+        <w:t>прокси с ключами. Панель управления поднимается одним процессом на локальном порту, и вся работа видна в браузере на той же машине.</w:t>
       </w:r>
     </w:p>
     <w:p>
       <w:r>
-        <w:lastRenderedPageBreak/>
-        <w:t>Порядок запуска: поднять стек графа знаний, запустить прокси моделей, запустить панель, выбрать субъект опыта и нажать кнопку нужного этапа (эпизод, разведка, оценка кандидатов, полный цикл). Отдельно настраивается шлюз расширения, котор</w:t>
-      </w:r>
-      <w:r>
-        <w:t>ый превращает сессии внешнего агента в записи того же графа, поэтому опыт не распадается на две базы.</w:t>
+        <w:t>Порядок запуска: поднять стек графа знаний, запустить прокси моделей, запустить панель, выбрать субъект опыта и нажать кнопк</w:t>
+      </w:r>
+      <w:r>
+        <w:t>у нужного этапа (эпизод, разведка, оценка кандидатов, полный цикл). Отдельно настраивается шлюз расширения, который превращает сессии внешнего агента в записи того же графа, поэтому опыт не распадается на две базы.</w:t>
       </w:r>
     </w:p>
     <w:p>
       <w:pPr>
         <w:pStyle w:val="1"/>
       </w:pPr>
-      <w:bookmarkStart w:id="19" w:name="_Toc240979888"/>
+      <w:bookmarkStart w:id="19" w:name="_Toc240988213"/>
       <w:r>
         <w:rPr>
           <w:rFonts w:ascii="Times New Roman" w:hAnsi="Times New Roman"/>
@@ -3520,21 +3542,24 @@
       <w:pPr>
         <w:pStyle w:val="21"/>
       </w:pPr>
-      <w:bookmarkStart w:id="20" w:name="_Toc240979889"/>
+      <w:bookmarkStart w:id="20" w:name="_Toc240988214"/>
       <w:r>
         <w:rPr>
           <w:rFonts w:ascii="Times New Roman" w:hAnsi="Times New Roman"/>
         </w:rPr>
-        <w:t>4.1. Как измеряется улучшение</w:t>
+        <w:t>4.1</w:t>
+      </w:r>
+      <w:r>
+        <w:rPr>
+          <w:rFonts w:ascii="Times New Roman" w:hAnsi="Times New Roman"/>
+        </w:rPr>
+        <w:t>. Как измеряется улучшение</w:t>
       </w:r>
       <w:bookmarkEnd w:id="20"/>
     </w:p>
     <w:p>
       <w:r>
-        <w:t xml:space="preserve">Правила приёмки формулируются до поиска и не меняются внутри раунда; каждое их </w:t>
-      </w:r>
-      <w:r>
-        <w:t>изменение вызывалось конкретным измерением, которое предыдущая версия пропустила. Правил было пять версий.</w:t>
+        <w:t>Правила приёмки формулируются до поиска и не меняются внутри раунда; каждое их изменение вызывалось конкретным измерением, которое предыдущая версия пропустила. Правил было пять версий.</w:t>
       </w:r>
     </w:p>
     <w:tbl>
@@ -3645,7 +3670,20 @@
               <w:rPr>
                 <w:sz w:val="24"/>
               </w:rPr>
-              <w:t>требование покрытия: экономия признаётся, только если решения кандидата восстановимы</w:t>
+              <w:t>требо</w:t>
+            </w:r>
+            <w:r>
+              <w:rPr>
+                <w:sz w:val="24"/>
+              </w:rPr>
+              <w:t xml:space="preserve">вание покрытия: экономия признаётся, только </w:t>
+            </w:r>
+            <w:r>
+              <w:rPr>
+                <w:sz w:val="24"/>
+              </w:rPr>
+              <w:lastRenderedPageBreak/>
+              <w:t>если решения кандидата восстановимы</w:t>
             </w:r>
           </w:p>
         </w:tc>
@@ -3663,13 +3701,15 @@
               <w:rPr>
                 <w:sz w:val="24"/>
               </w:rPr>
-              <w:t>раунды 2 и 3 развернули ул</w:t>
-            </w:r>
-            <w:r>
-              <w:rPr>
-                <w:sz w:val="24"/>
-              </w:rPr>
-              <w:t>учшения при 0 восстановленных решениях из 26, и оба оказались хуже</w:t>
+              <w:lastRenderedPageBreak/>
+              <w:t xml:space="preserve">раунды 2 и 3 развернули улучшения при 0 </w:t>
+            </w:r>
+            <w:r>
+              <w:rPr>
+                <w:sz w:val="24"/>
+              </w:rPr>
+              <w:lastRenderedPageBreak/>
+              <w:t>восстановленных решениях из 26, и оба оказались хуже</w:t>
             </w:r>
           </w:p>
         </w:tc>
@@ -3689,6 +3729,7 @@
               <w:rPr>
                 <w:sz w:val="24"/>
               </w:rPr>
+              <w:lastRenderedPageBreak/>
               <w:t>v3</w:t>
             </w:r>
           </w:p>
@@ -3725,7 +3766,13 @@
               <w:rPr>
                 <w:sz w:val="24"/>
               </w:rPr>
-              <w:t>три кандидата с прогнозом от +22,5 до +26,6 процента и без единого восстановленного решения</w:t>
+              <w:t>три кан</w:t>
+            </w:r>
+            <w:r>
+              <w:rPr>
+                <w:sz w:val="24"/>
+              </w:rPr>
+              <w:t>дидата с прогнозом от +22,5 до +26,6 процента и без единого восстановленного решения</w:t>
             </w:r>
           </w:p>
         </w:tc>
@@ -3763,13 +3810,7 @@
               <w:rPr>
                 <w:sz w:val="24"/>
               </w:rPr>
-              <w:t>политика, меняюща</w:t>
-            </w:r>
-            <w:r>
-              <w:rPr>
-                <w:sz w:val="24"/>
-              </w:rPr>
-              <w:t>я то, что агент видит, обязана измеряться в рабочем режиме независимо от покрытия</w:t>
+              <w:t>политика, меняющая то, что агент видит, обязана измеряться в рабочем режиме независимо от покрытия</w:t>
             </w:r>
           </w:p>
         </w:tc>
@@ -3787,7 +3828,13 @@
               <w:rPr>
                 <w:sz w:val="24"/>
               </w:rPr>
-              <w:t>контрольная политика window3: прогноз +7,6 процента при покрытии 72,7 процента, измерение дало +12,4 процента хуже, а на отложенных задачах +81,8 процента хуже</w:t>
+              <w:t>контрольная политика window3: прогноз +7,6 процента при покрытии 72,</w:t>
+            </w:r>
+            <w:r>
+              <w:rPr>
+                <w:sz w:val="24"/>
+              </w:rPr>
+              <w:t>7 процента, измерение дало +12,4 процента хуже, а на отложенных задачах +81,8 процента хуже</w:t>
             </w:r>
           </w:p>
         </w:tc>
@@ -3825,13 +3872,7 @@
               <w:rPr>
                 <w:sz w:val="24"/>
               </w:rPr>
-              <w:t>три прогон</w:t>
-            </w:r>
-            <w:r>
-              <w:rPr>
-                <w:sz w:val="24"/>
-              </w:rPr>
-              <w:t>а на задачу вместо одного, прежде чем называть число</w:t>
+              <w:t>три прогона на задачу вместо одного, прежде чем называть число</w:t>
             </w:r>
           </w:p>
         </w:tc>
@@ -3858,32 +3899,34 @@
     <w:p/>
     <w:p>
       <w:r>
-        <w:t xml:space="preserve">Измерение в рабочем режиме дорого, поэтому перед каждым раундом судья решает большинство кандидатов бесплатно, а </w:t>
-      </w:r>
-      <w:r>
-        <w:t>платят только за тех, кого судья не смог оценить или кто меняет поведение агента. Шум самого провайдера проверен контрольной политикой: одна и та же обвязка при повторах даёт разброс около плюс-минус 20 процентов, поэтому одиночный прогон не доказывает нич</w:t>
-      </w:r>
-      <w:r>
-        <w:t>его.</w:t>
+        <w:t>Измерение в</w:t>
+      </w:r>
+      <w:r>
+        <w:t xml:space="preserve"> рабочем режиме дорого, поэтому перед каждым раундом судья решает большинство кандидатов бесплатно, а платят только за тех, кого судья не смог оценить или кто меняет поведение агента. Шум самого провайдера проверен контрольной политикой: одна и та же обвяз</w:t>
+      </w:r>
+      <w:r>
+        <w:t>ка при повторах даёт разброс около плюс-минус 20 процентов, поэтому одиночный прогон не доказывает ничего.</w:t>
       </w:r>
     </w:p>
     <w:p>
       <w:pPr>
         <w:pStyle w:val="21"/>
       </w:pPr>
-      <w:bookmarkStart w:id="21" w:name="_Toc240979890"/>
+      <w:bookmarkStart w:id="21" w:name="_Toc240988215"/>
       <w:r>
         <w:rPr>
           <w:rFonts w:ascii="Times New Roman" w:hAnsi="Times New Roman"/>
         </w:rPr>
-        <w:lastRenderedPageBreak/>
         <w:t>4.2. Сон в детерминированных мирах</w:t>
       </w:r>
       <w:bookmarkEnd w:id="21"/>
     </w:p>
     <w:p>
       <w:r>
-        <w:t>Восемь независимых прогонов (пять зёрен островного мира, три зерна мастерской, по три раунда), измеренных в самом мире, а не по оценке судьи:</w:t>
+        <w:t xml:space="preserve">Восемь независимых прогонов (пять зёрен островного мира, три зерна мастерской, по три раунда), измеренных в самом </w:t>
+      </w:r>
+      <w:r>
+        <w:t>мире, а не по оценке судьи:</w:t>
       </w:r>
     </w:p>
     <w:tbl>
@@ -4255,20 +4298,21 @@
         <w:t>oneiro-1</w:t>
       </w:r>
       <w:r>
-        <w:t xml:space="preserve">), и он принимается как </w:t>
-      </w:r>
-      <w:r>
-        <w:t>честная нижняя граница метода на этом мире. Оценка судьи при этом завышает результат на 22 до 30 процентов относительно измеренного: судья хорошо упорядочивает кандидатов и не годится как предсказание. Это ограничение важнее самого успеха, и оно перенесено</w:t>
-      </w:r>
-      <w:r>
-        <w:t xml:space="preserve"> в правила приёмки.</w:t>
+        <w:t>), и он принимается как честная нижняя граница метода на этом мире. Оценка судьи при этом завышает результат на 22 до 30 процентов относительно измеренного: судья</w:t>
+      </w:r>
+      <w:r>
+        <w:t xml:space="preserve"> хорошо упорядочивает </w:t>
+      </w:r>
+      <w:r>
+        <w:lastRenderedPageBreak/>
+        <w:t>кандидатов и не годится как предсказание. Это ограничение важнее самого успеха, и оно перенесено в правила приёмки.</w:t>
       </w:r>
     </w:p>
     <w:p>
       <w:pPr>
         <w:pStyle w:val="21"/>
       </w:pPr>
-      <w:bookmarkStart w:id="22" w:name="_Toc240979891"/>
+      <w:bookmarkStart w:id="22" w:name="_Toc240988216"/>
       <w:r>
         <w:rPr>
           <w:rFonts w:ascii="Times New Roman" w:hAnsi="Times New Roman"/>
@@ -4279,7 +4323,10 @@
     </w:p>
     <w:p>
       <w:r>
-        <w:t>Прямой замер памяти на одном эпизоде из 25 записанных попыток, с отключением отдельных видов связей:</w:t>
+        <w:t xml:space="preserve">Прямой замер памяти на одном эпизоде из 25 записанных попыток, с отключением отдельных </w:t>
+      </w:r>
+      <w:r>
+        <w:t>видов связей:</w:t>
       </w:r>
     </w:p>
     <w:tbl>
@@ -4466,13 +4513,7 @@
               <w:rPr>
                 <w:sz w:val="24"/>
               </w:rPr>
-              <w:t xml:space="preserve">плоское </w:t>
-            </w:r>
-            <w:r>
-              <w:rPr>
-                <w:sz w:val="24"/>
-              </w:rPr>
-              <w:t>хранилище (неупорядоченный список)</w:t>
+              <w:t>плоское хранилище (неупорядоченный список)</w:t>
             </w:r>
           </w:p>
         </w:tc>
@@ -4694,7 +4735,13 @@
               <w:rPr>
                 <w:sz w:val="24"/>
               </w:rPr>
-              <w:t>граф без связей происхождения</w:t>
+              <w:t xml:space="preserve">граф без связей </w:t>
+            </w:r>
+            <w:r>
+              <w:rPr>
+                <w:sz w:val="24"/>
+              </w:rPr>
+              <w:t>происхождения</w:t>
             </w:r>
           </w:p>
         </w:tc>
@@ -4858,49 +4905,43 @@
         <w:t>происхождение</w:t>
       </w:r>
       <w:r>
-        <w:t xml:space="preserve"> (без </w:t>
-      </w:r>
-      <w:r>
-        <w:lastRenderedPageBreak/>
-        <w:t>этих связей признак источник-вид не переживает выборку вовсе). Это сильнейшее и</w:t>
-      </w:r>
-      <w:r>
-        <w:t>меющееся у нас свидетельство того, что структура несёт нагрузку, и одновременно самое слабое место: замер сделан на одном эпизоде, и он измеряет качество выборки, а не влияние на результат работы.</w:t>
+        <w:t xml:space="preserve"> (без этих связей признак источник-вид не переживает выборку вовсе). Это сильнейшее имеющееся у нас свидетельство того, что структура несёт нагрузку, и одновременно самое слаб</w:t>
+      </w:r>
+      <w:r>
+        <w:t>ое место: замер сделан на одном эпизоде, и он измеряет качество выборки, а не влияние на результат работы.</w:t>
       </w:r>
     </w:p>
     <w:p>
       <w:r>
-        <w:t>Проверка на публичном наборе LongMemEval (детали в приложен</w:t>
-      </w:r>
-      <w:r>
-        <w:t>ии А) равна по итогу: плоский журнал 72,7 процента, граф 72,1 процента, без памяти 4,1 процента. Разница между двумя видами памяти внутри шума, а разделение по типам вопросов показывает, где именно структура помогает: на вопросах о времени граф даёт 40,0 п</w:t>
-      </w:r>
-      <w:r>
-        <w:t>роцента против 16,7 у плоского журнала, а на многосессионных вопросах проигрывает (58,3 против 66,7). Полный контекст без всякой выборки даёт до 94 процентов, то есть сама задача для нашей модели разрешима, и упрощать её мы не стали.</w:t>
+        <w:t>Проверка на публичном наборе LongMemEval (детали в приложении А) равна по итогу: плоский журнал 72,7 процента, граф 72,1 процента, без памяти 4,1 про</w:t>
+      </w:r>
+      <w:r>
+        <w:t>цента. Разница между двумя видами памяти внутри шума, а разделение по типам вопросов показывает, где именно структура помогает: на вопросах о времени граф даёт 40,0 процента против 16,7 у плоского журнала, а на многосессионных вопросах проигрывает (58,3 пр</w:t>
+      </w:r>
+      <w:r>
+        <w:t>отив 66,7). Полный контекст без всякой выборки даёт до 94 процентов, то есть сама задача для нашей модели разрешима, и упрощать её мы не стали.</w:t>
       </w:r>
     </w:p>
     <w:p>
       <w:pPr>
         <w:pStyle w:val="21"/>
       </w:pPr>
-      <w:bookmarkStart w:id="23" w:name="_Toc240979892"/>
+      <w:bookmarkStart w:id="23" w:name="_Toc240988217"/>
       <w:r>
         <w:rPr>
           <w:rFonts w:ascii="Times New Roman" w:hAnsi="Times New Roman"/>
         </w:rPr>
-        <w:t>4.4. Поиск по обвязке:</w:t>
-      </w:r>
-      <w:r>
-        <w:rPr>
-          <w:rFonts w:ascii="Times New Roman" w:hAnsi="Times New Roman"/>
-        </w:rPr>
-        <w:t xml:space="preserve"> одиннадцать раундов</w:t>
+        <w:lastRenderedPageBreak/>
+        <w:t>4.4. Поиск по обвязке: одиннадцать раундов</w:t>
       </w:r>
       <w:bookmarkEnd w:id="23"/>
     </w:p>
     <w:p>
       <w:r>
-        <w:t>Одиннадцать раундов, 29 предложенных кандидатов, четыре развёртывания. Результат первых десяти: ни одного, которое пережило бы честное измерение.</w:t>
+        <w:t>Одиннадцать раундов, 29 предложенных кандидатов, четыре развёртывания</w:t>
+      </w:r>
+      <w:r>
+        <w:t>. Результат первых десяти: ни одного, которое пережило бы честное измерение.</w:t>
       </w:r>
     </w:p>
     <w:tbl>
@@ -5092,14 +5133,7 @@
                 <w:b/>
                 <w:sz w:val="24"/>
               </w:rPr>
-              <w:t xml:space="preserve">+27,0 </w:t>
-            </w:r>
-            <w:r>
-              <w:rPr>
-                <w:b/>
-                <w:sz w:val="24"/>
-              </w:rPr>
-              <w:t>процента</w:t>
+              <w:t>+27,0 процента</w:t>
             </w:r>
             <w:r>
               <w:rPr>
@@ -5342,13 +5376,7 @@
               <w:rPr>
                 <w:sz w:val="24"/>
               </w:rPr>
-              <w:t xml:space="preserve">измерено и отклонено: прогноз </w:t>
-            </w:r>
-            <w:r>
-              <w:rPr>
-                <w:sz w:val="24"/>
-              </w:rPr>
-              <w:t>+32,0 процента, измерение +1,5 процента</w:t>
+              <w:t>измерено и отклонено: прогноз +32,0 процента, измерение +1,5 процента</w:t>
             </w:r>
           </w:p>
         </w:tc>
@@ -5404,7 +5432,13 @@
               <w:rPr>
                 <w:sz w:val="24"/>
               </w:rPr>
-              <w:t>развёрнуто по одному прогону на задачу (минус 3,4 процента); при трёх прогонах плюс 4,0 процента, переноса нет</w:t>
+              <w:t xml:space="preserve">развёрнуто по одному </w:t>
+            </w:r>
+            <w:r>
+              <w:rPr>
+                <w:sz w:val="24"/>
+              </w:rPr>
+              <w:t>прогону на задачу (минус 3,4 процента); при трёх прогонах плюс 4,0 процента, переноса нет</w:t>
             </w:r>
           </w:p>
         </w:tc>
@@ -5523,35 +5557,20 @@
                 <w:b/>
                 <w:sz w:val="24"/>
               </w:rPr>
-              <w:t xml:space="preserve">минус 13,3 </w:t>
+              <w:t>минус 13,3 процента</w:t>
+            </w:r>
+            <w:r>
+              <w:rPr>
+                <w:sz w:val="24"/>
+              </w:rPr>
+              <w:t xml:space="preserve">, отложенные задачи </w:t>
             </w:r>
             <w:r>
               <w:rPr>
                 <w:b/>
                 <w:sz w:val="24"/>
               </w:rPr>
-              <w:lastRenderedPageBreak/>
-              <w:t>процента</w:t>
-            </w:r>
-            <w:r>
-              <w:rPr>
-                <w:sz w:val="24"/>
-              </w:rPr>
-              <w:t xml:space="preserve">, отложенные задачи </w:t>
-            </w:r>
-            <w:r>
-              <w:rPr>
-                <w:b/>
-                <w:sz w:val="24"/>
-              </w:rPr>
-              <w:t xml:space="preserve">минус </w:t>
-            </w:r>
-            <w:r>
-              <w:rPr>
-                <w:b/>
-                <w:sz w:val="24"/>
-              </w:rPr>
-              <w:t>28,5 процента</w:t>
+              <w:t>минус 28,5 процента</w:t>
             </w:r>
             <w:r>
               <w:rPr>
@@ -5566,33 +5585,37 @@
     <w:p/>
     <w:p>
       <w:r>
-        <w:t>Раунд 11 это единственная защищаемая экономия за всю историю. Политика в нём состоит из двух полей: отсутствие начального вывода тестов в первом запросе и более длинные наблюдения инструментов (1500 символов вместо 1000). По от</w:t>
-      </w:r>
-      <w:r>
-        <w:t>дельности ни одно поле не работает (первое поле в одиночку дало плюс 27 процентов в раунде 2), работает только их сочетание, и установить это можно было только измерением в рабочем режиме.</w:t>
+        <w:t xml:space="preserve">Раунд 11 это единственная защищаемая </w:t>
+      </w:r>
+      <w:r>
+        <w:t>экономия за всю историю. Политика в нём состоит из двух полей: отсутствие начального вывода тестов в первом запросе и более длинные наблюдения инструментов (1500 символов вместо 1000). По отдельности ни одно поле не работает (первое поле в одиночку дало пл</w:t>
+      </w:r>
+      <w:r>
+        <w:t>юс 27 процентов в раунде 2), работает только их сочетание, и установить это можно было только измерением в рабочем режиме.</w:t>
       </w:r>
     </w:p>
     <w:p>
       <w:r>
-        <w:t>За одиннадцать раундов потрачено 26 прогонов в рабочем режиме; если</w:t>
-      </w:r>
-      <w:r>
-        <w:t xml:space="preserve"> бы каждого из 29 кандидатов измеряли один раз на каждой поисковой задаче, потребовалось бы 116 прогонов. Экономия 90 прогонов (в 4,5 раза) на пути к этим решениям и есть экономический аргумент метода.</w:t>
+        <w:t>За одиннадцать раундов потрачено 26 прогонов в рабочем режиме; если бы каждого из 29 кандидатов измеряли один раз на каждой поисковой</w:t>
+      </w:r>
+      <w:r>
+        <w:t xml:space="preserve"> задаче, потребовалось бы 116 прогонов. Экономия 90 прогонов (в 4,5 раза) на пути к этим решениям и есть экономический аргумент метода.</w:t>
       </w:r>
     </w:p>
     <w:p>
       <w:r>
-        <w:t>Из девятнадцати отклонённых кандидатов большинство отк</w:t>
-      </w:r>
-      <w:r>
-        <w:t>лонено бесплатно, по записям. Судья ошибался в обе стороны: на семи написанных вручную обвязках его оценка расходилась с измерением от минус 43 до плюс 26 процентов.</w:t>
+        <w:lastRenderedPageBreak/>
+        <w:t>Из девятнадцати отклонённых кандидатов большинство отклонено бесплатно, по записям. Судья ошибался в обе стороны: на сем</w:t>
+      </w:r>
+      <w:r>
+        <w:t>и написанных вручную обвязках его оценка расходилась с измерением от минус 43 до плюс 26 процентов.</w:t>
       </w:r>
     </w:p>
     <w:p>
       <w:pPr>
         <w:pStyle w:val="21"/>
       </w:pPr>
-      <w:bookmarkStart w:id="24" w:name="_Toc240979893"/>
+      <w:bookmarkStart w:id="24" w:name="_Toc240988218"/>
       <w:r>
         <w:rPr>
           <w:rFonts w:ascii="Times New Roman" w:hAnsi="Times New Roman"/>
@@ -5603,18 +5626,18 @@
     </w:p>
     <w:p>
       <w:r>
-        <w:t>Живая запись в графе знаний на момент подготовки</w:t>
-      </w:r>
-      <w:r>
-        <w:t xml:space="preserve"> работы содержит 69 записей организации: 4 запуска цикла, 6 циклов, 6 наборов предложений и 6 решений менеджера, 6 созданных рабочих копий, 5 записей о пакетах изменений, 1 запись о возобновлении после перезапуска, 3 записи о запуске шлюза расширения и по </w:t>
-      </w:r>
-      <w:r>
-        <w:t>одной записи о срыве цикла и о срыве heartbeat.</w:t>
+        <w:t>Живая запись в графе знаний на момент подготовки работы содержит 69 записей организации: 4 запуска цикла, 6 циклов</w:t>
+      </w:r>
+      <w:r>
+        <w:t>, 6 наборов предложений и 6 решений менеджера, 6 созданных рабочих копий, 5 записей о пакетах изменений, 1 запись о возобновлении после перезапуска, 3 записи о запуске шлюза расширения и по одной записи о срыве цикла и о срыве heartbeat.</w:t>
       </w:r>
     </w:p>
     <w:p>
       <w:r>
-        <w:t xml:space="preserve">Из пяти записей о пакетах четыре принадлежат живым прогонам, а одна оставлена проверкой расширения шлюза (имя ветки содержит слово </w:t>
+        <w:t xml:space="preserve">Из пяти записей о </w:t>
+      </w:r>
+      <w:r>
+        <w:t xml:space="preserve">пакетах четыре принадлежат живым прогонам, а одна оставлена проверкой расширения шлюза (имя ветки содержит слово </w:t>
       </w:r>
       <w:r>
         <w:rPr>
@@ -5624,26 +5647,22 @@
         <w:t>test</w:t>
       </w:r>
       <w:r>
-        <w:t>, изменённых файлов ноль). Записи не удаляются: журнал показывает и рабоч</w:t>
-      </w:r>
-      <w:r>
-        <w:t>ие циклы, и испытания, потому что этим он и отличается от отчёта, сочинённого в конце.</w:t>
+        <w:t xml:space="preserve">, изменённых файлов ноль). Записи не удаляются: журнал показывает и рабочие циклы, и испытания, потому что этим он и отличается от отчёта, </w:t>
+      </w:r>
+      <w:r>
+        <w:t>сочинённого в конце.</w:t>
       </w:r>
     </w:p>
     <w:p>
       <w:r>
-        <w:lastRenderedPageBreak/>
-        <w:t xml:space="preserve">Срывы тоже названы: цикл сорвался один раз, когда провайдер отдал ошибку соединения, страховая модель ответила не по схеме, менеджер записал ошибку схемы, и цикл был </w:t>
-      </w:r>
-      <w:r>
-        <w:t>пропущен без заморозки системы.</w:t>
+        <w:t>Срывы тоже названы: цикл сорвался один раз, когда провайдер отдал ошибку соединения, страховая модель ответила не по схеме, менеджер записал ошибку схемы, и цикл был пропущен без заморозки системы.</w:t>
       </w:r>
     </w:p>
     <w:p>
       <w:pPr>
         <w:pStyle w:val="1"/>
       </w:pPr>
-      <w:bookmarkStart w:id="25" w:name="_Toc240979894"/>
+      <w:bookmarkStart w:id="25" w:name="_Toc240988219"/>
       <w:r>
         <w:rPr>
           <w:rFonts w:ascii="Times New Roman" w:hAnsi="Times New Roman"/>
@@ -5654,27 +5673,31 @@
     </w:p>
     <w:p>
       <w:r>
-        <w:t>Поставленные задачи решены в следующем объёме.</w:t>
+        <w:t>Поставленные задачи решены</w:t>
+      </w:r>
+      <w:r>
+        <w:t xml:space="preserve"> в следующем объёме.</w:t>
       </w:r>
     </w:p>
     <w:p>
       <w:r>
-        <w:t xml:space="preserve">Онтология опыта описана и работает: полная траектория агента, включая состояния, допустимые действия и числовые исходы, записывается в граф знаний, и связи времени и </w:t>
-      </w:r>
-      <w:r>
-        <w:t>происхождения в нём проверены отключением (задача 1). Механизм самоулучшения реализован и измерен на двух структурно разных мирах: восемь из восьми зёрен улучшились после одного сна, от +14,7 до +114,9 (задача 2). Цикл перенесён на реального кодирующего аг</w:t>
-      </w:r>
-      <w:r>
-        <w:t>ента; судья по записям восстанавливает запросы посимвольно, а правило «политику, меняющую поведение, измерять в рабочем режиме» появилось именно на этом переносе (задача 3). Правила приёмки заморожены и пересматривались пять раз, каждое изменение вынуждено</w:t>
-      </w:r>
-      <w:r>
-        <w:t xml:space="preserve"> измерением; измерение с тремя повторами отделило настоящую экономию от шума провайдера в плюс-минус 20 процентов (задача 4). Память сравнена на публичном наборе с плоским журналом и без памяти; подстройка под известный протокол судьи сохранена (задача 5).</w:t>
-      </w:r>
-      <w:r>
-        <w:t xml:space="preserve"> Автономный цикл из трёх ролей работает, переживает перезапуск процесса и оставляет незалитые пакеты изменений с доказательствами (задача 6). Практическое применение описано двумя сценариями, для долгого проекта и для повседневной работы, вместе с требован</w:t>
-      </w:r>
-      <w:r>
-        <w:t>иями к запуску (задача 7).</w:t>
+        <w:t>Онтология опыта описана и работает: полная траектория агента, включая состояния, допустимые действия и числовые исходы, записывается в граф знаний, и связи времени и происхождения в нём проверены отключением (задача 1). Механизм самоул</w:t>
+      </w:r>
+      <w:r>
+        <w:t>учшения реализован и измерен на двух структурно разных мирах: восемь из восьми зёрен улучшились после одного сна, от +14,7 до +114,9 (задача 2). Цикл перенесён на реального кодирующего агента; судья по записям восстанавливает запросы посимвольно, а правило</w:t>
+      </w:r>
+      <w:r>
+        <w:t xml:space="preserve"> «политику, меняющую поведение, измерять в рабочем режиме» появилось именно на этом переносе (задача 3). Правила приёмки заморожены и пересматривались пять </w:t>
+      </w:r>
+      <w:r>
+        <w:lastRenderedPageBreak/>
+        <w:t xml:space="preserve">раз, каждое изменение вынуждено измерением; измерение с тремя повторами отделило настоящую экономию </w:t>
+      </w:r>
+      <w:r>
+        <w:t>от шума провайдера в плюс-минус 20 процентов (задача 4). Память сравнена на публичном наборе с плоским журналом и без памяти; подстройка под известный протокол судьи сохранена (задача 5). Автономный цикл из трёх ролей работает, переживает перезапуск процес</w:t>
+      </w:r>
+      <w:r>
+        <w:t>са и оставляет незалитые пакеты изменений с доказательствами (задача 6). Практическое применение описано двумя сценариями, для долгого проекта и для повседневной работы, вместе с требованиями к запуску (задача 7).</w:t>
       </w:r>
     </w:p>
     <w:p>
@@ -5685,100 +5708,99 @@
         <w:t>Практический итог.</w:t>
       </w:r>
       <w:r>
-        <w:t xml:space="preserve"> Система работает как помощник, а не как лабораторная демонстрация. Она ведёт цикл из трёх ролей, помнит свою работу записями в графе, продолжает её после перезапуска процесса и оставляет человеку готовые к пров</w:t>
-      </w:r>
-      <w:r>
-        <w:t xml:space="preserve">ерке пакеты изменений. Опыт, записанный с онтологией, позволяет отбирать улучшения почти бесплатно: из 29 предложенных кандидатов 19 отклонены по записям без единого запуска, а один развёрнутый вариант дал переносимую экономию запросов на реальном </w:t>
-      </w:r>
-      <w:r>
-        <w:lastRenderedPageBreak/>
-        <w:t xml:space="preserve">агенте. </w:t>
-      </w:r>
-      <w:r>
-        <w:t xml:space="preserve">Память сравнена с плоским журналом и с полным отсутствием памяти на публичном наборе: без памяти 4,1 процента, с памятью около 72 процентов, а структура графа выигрывает там, где она и должна выигрывать: на вопросах о времени (40,0 против 16,7 процента) и </w:t>
-      </w:r>
-      <w:r>
-        <w:t>на сохранении порядка и происхождения записей.</w:t>
+        <w:t xml:space="preserve"> Система работает как по</w:t>
+      </w:r>
+      <w:r>
+        <w:t>мощник, а не как лабораторная демонстрация. Она ведёт цикл из трёх ролей, помнит свою работу записями в графе, продолжает её после перезапуска процесса и оставляет человеку готовые к проверке пакеты изменений. Опыт, записанный с онтологией, позволяет отбир</w:t>
+      </w:r>
+      <w:r>
+        <w:t>ать улучшения почти бесплатно: из 29 предложенных кандидатов 19 отклонены по записям без единого запуска, а один развёрнутый вариант дал переносимую экономию запросов на реальном агенте. Память сравнена с плоским журналом и с полным отсутствием памяти на п</w:t>
+      </w:r>
+      <w:r>
+        <w:t>убличном наборе: без памяти 4,1 процента, с памятью около 72 процентов, а структура графа выигрывает там, где она и должна выигрывать: на вопросах о времени (40,0 против 16,7 процента) и на сохранении порядка и происхождения записей.</w:t>
       </w:r>
     </w:p>
     <w:p>
       <w:r>
-        <w:t>Отсюда ближайшие направления работы. Первое: довести до конца канал, которым система сама сообщает о решении человеку, чтобы отчёт приходил в мессенджер, а не ждал в журнале. Второе: расширить предмет работы з</w:t>
-      </w:r>
-      <w:r>
-        <w:t xml:space="preserve">а пределы кода (почта, таблицы, документы по образцу), потому что помощник в повседневной работе школы и офиса это тот же двигатель с другим предметом. Третье: перенести чтение записей внутрь графа на всех площадках, включая поиск по обвязке, чтобы память </w:t>
-      </w:r>
-      <w:r>
-        <w:t>агента была одинаковой в мире и в живой работе. Четвёртое: расширить набор задач с шести до двенадцати и более и повторить замер памяти, чтобы разница между видами памяти перестала быть в пределах шума.</w:t>
+        <w:t>Отсюда ближайшие напра</w:t>
+      </w:r>
+      <w:r>
+        <w:t>вления работы. Первое: расширить предмет работы за пределы кода (почта, таблицы, документы по образцу), потому что помощник в повседневной работе школы и офиса это тот же двигатель с другим предметом; канал, которым решение уходит человеку и возвращается е</w:t>
+      </w:r>
+      <w:r>
+        <w:t>го нажатием, для этого уже есть. Третье: перенести чтение записей внутрь графа на всех площадках, включая поиск по обвязке, чтобы память агента была одинаковой в мире и в живой работе. Четвёртое: расширить набор задач с шести до двенадцати и более и повтор</w:t>
+      </w:r>
+      <w:r>
+        <w:t>ить замер памяти, чтобы разница между видами памяти перестала быть в пределах шума.</w:t>
       </w:r>
     </w:p>
     <w:p>
       <w:pPr>
         <w:pStyle w:val="1"/>
       </w:pPr>
-      <w:bookmarkStart w:id="26" w:name="_Toc240979895"/>
+      <w:bookmarkStart w:id="26" w:name="_Toc240988220"/>
       <w:r>
         <w:rPr>
           <w:rFonts w:ascii="Times New Roman" w:hAnsi="Times New Roman"/>
         </w:rPr>
+        <w:lastRenderedPageBreak/>
         <w:t>Список использованных источников</w:t>
       </w:r>
       <w:bookmarkEnd w:id="26"/>
     </w:p>
     <w:p>
       <w:r>
-        <w:t>1. Голенков В.В., Гу</w:t>
-      </w:r>
-      <w:r>
-        <w:t>лякина Н.А. Открытая семантическая технология проектирования интеллектуальных систем (OSTIS) // Сборник научных трудов OSTIS. Минск, 2023. URL: https://proc.ostis.net/proc/Proceedings%20OSTIS-2023.pdf (дата обращения: 22.09.2026).</w:t>
+        <w:t xml:space="preserve">1. Голенков В.В., Гулякина Н.А. Открытая семантическая технология проектирования интеллектуальных систем (OSTIS) // Сборник научных трудов </w:t>
+      </w:r>
+      <w:r>
+        <w:t>OSTIS. Минск, 2023. URL: https://proc.ostis.net/proc/Proceedings%20OSTIS-2023.pdf (дата обращения: 22.09.2026).</w:t>
       </w:r>
     </w:p>
     <w:p>
       <w:r>
-        <w:t>2. Голенков В.В. и др. Ин</w:t>
-      </w:r>
-      <w:r>
-        <w:t>теллектуальные компьютерные системы нового поколения // Доклады БГУИР. 2024. URL: https://doklady.bsuir.by/jour/article/view/3906 (дата обращения: 22.09.2026).</w:t>
+        <w:t>2. Голенков В.В. и др. Интеллектуальные компьютерные системы нового поколения // Доклады БГУИР. 2024. URL: https://doklady.bsuir.by/jour/article</w:t>
+      </w:r>
+      <w:r>
+        <w:t>/view/3906 (дата обращения: 22.09.2026).</w:t>
       </w:r>
     </w:p>
     <w:p>
       <w:r>
-        <w:t>3. Технология OSTIS: программная платформа (sc-machine, sc-web, py-sc-client). URL: https://gith</w:t>
-      </w:r>
-      <w:r>
-        <w:t>ub.com/ostis-ai (дата обращения: 22.09.2026).</w:t>
+        <w:t>3. Технология OSTIS: программная платформа (sc-machine, sc-web, py-sc-client). URL: https://github.com/ostis-ai (дата обращения: 22.09.2026).</w:t>
       </w:r>
     </w:p>
     <w:p>
       <w:r>
-        <w:t>4. Dream-RSI: накопленная история как симулятор для поиска стратегий. arXiv:2609.14858 (текст статьи передан руководителю работы).</w:t>
+        <w:t>4. Dream-RSI: накопленная история как симулятор для поиска стратегий. arX</w:t>
+      </w:r>
+      <w:r>
+        <w:t>iv:2609.14858 (текст статьи передан руководителю работы).</w:t>
       </w:r>
     </w:p>
     <w:p>
       <w:r>
-        <w:t>5. Meta-Harness: оптимизация обвязки агента по полным траекториям. arXiv:2603.2</w:t>
-      </w:r>
-      <w:r>
-        <w:t>8052 (текст статьи передан руководителю работы).</w:t>
+        <w:t>5. Meta-Harness: оптимизация обвязки агента по полным траекториям. arXiv:2603.28052 (текст статьи передан руководителю работы).</w:t>
       </w:r>
     </w:p>
     <w:p>
       <w:r>
-        <w:lastRenderedPageBreak/>
-        <w:t>6. SoL-Pi: рекурсивное масштабирование автоматического исследования на уровне обвязки. arXiv:2609.20519 (текст статьи передан руководителю работы).</w:t>
+        <w:t>6. SoL-Pi: рекурсивное масштабирование автоматического исследования на</w:t>
+      </w:r>
+      <w:r>
+        <w:t xml:space="preserve"> уровне обвязки. arXiv:2609.20519 (текст статьи передан руководителю работы).</w:t>
       </w:r>
     </w:p>
     <w:p>
       <w:r>
-        <w:t>7. GAVEL: явная символьная модель мира для проверки и почин</w:t>
-      </w:r>
-      <w:r>
-        <w:t>ки планов. arXiv:2609.19315 (текст статьи передан руководителю работы).</w:t>
+        <w:t>7. GAVEL: явная символьная модель мира для проверки и починки планов. arXiv:2609.19315 (текст статьи передан руководителю работы).</w:t>
       </w:r>
     </w:p>
     <w:p>
       <w:r>
-        <w:t>8. Wu D. et al. LongMemEval: Benchmarking Chat Assistants on Long-Term Interactive Memory // arXiv:2410.10813, 2024. URL: https://arxiv.org/abs/2410.10813 (дата обращения: 22.09.2026).</w:t>
+        <w:t xml:space="preserve">8. Wu D. et al. LongMemEval: Benchmarking Chat </w:t>
+      </w:r>
+      <w:r>
+        <w:t>Assistants on Long-Term Interactive Memory // arXiv:2410.10813, 2024. URL: https://arxiv.org/abs/2410.10813 (дата обращения: 22.09.2026).</w:t>
       </w:r>
     </w:p>
     <w:p>
@@ -5803,7 +5825,10 @@
         <w:t>bench/memory/README.md</w:t>
       </w:r>
       <w:r>
-        <w:t>), живой организационный цикл (</w:t>
+        <w:t>),</w:t>
+      </w:r>
+      <w:r>
+        <w:t xml:space="preserve"> живой организационный цикл (</w:t>
       </w:r>
       <w:r>
         <w:rPr>
@@ -5836,19 +5861,13 @@
         <w:pStyle w:val="1"/>
         <w:jc w:val="right"/>
       </w:pPr>
-      <w:bookmarkStart w:id="27" w:name="_Toc240979896"/>
+      <w:bookmarkStart w:id="27" w:name="_Toc240988221"/>
       <w:r>
         <w:rPr>
           <w:rFonts w:ascii="Times New Roman" w:hAnsi="Times New Roman"/>
         </w:rPr>
         <w:lastRenderedPageBreak/>
-        <w:t>Приложение А. Замер памяти на</w:t>
-      </w:r>
-      <w:r>
-        <w:rPr>
-          <w:rFonts w:ascii="Times New Roman" w:hAnsi="Times New Roman"/>
-        </w:rPr>
-        <w:t xml:space="preserve"> публичном наборе LongMemEval</w:t>
+        <w:t>Приложение А. Замер памяти на публичном наборе LongMemEval</w:t>
       </w:r>
       <w:bookmarkEnd w:id="27"/>
     </w:p>
@@ -5864,7 +5883,10 @@
         <w:t>longmemeval-cleaned</w:t>
       </w:r>
       <w:r>
-        <w:t xml:space="preserve">), 50 вопросов из 500, шесть типов. Стадии: </w:t>
+        <w:t>), 50 вопросов из 50</w:t>
+      </w:r>
+      <w:r>
+        <w:t xml:space="preserve">0, шесть типов. Стадии: </w:t>
       </w:r>
       <w:r>
         <w:rPr>
@@ -5884,18 +5906,15 @@
         <w:t>s</w:t>
       </w:r>
       <w:r>
-        <w:t xml:space="preserve"> (полные истории, выборка ограничена 100 сессиями с о</w:t>
-      </w:r>
-      <w:r>
-        <w:t>бязательным сохранением сессий с ответом). Порядок вариантов одинаков на всех стадиях: ответ дают те же модели, судью проводят те же модели, меняется только вид памяти. Разные модели-ответчики указаны отдельно, потому что потолок зависит именно от них.</w:t>
+        <w:t xml:space="preserve"> (полные истории, выборка ограничена 100 сессиями с обязательным сохранением сессий с ответом). Порядок вариантов одинаков на всех стадиях: ответ дают те же модели, судью п</w:t>
+      </w:r>
+      <w:r>
+        <w:t>роводят те же модели, меняется только вид памяти. Разные модели-ответчики указаны отдельно, потому что потолок зависит именно от них.</w:t>
       </w:r>
     </w:p>
     <w:p>
       <w:r>
-        <w:t>Ста</w:t>
-      </w:r>
-      <w:r>
-        <w:t xml:space="preserve">дия </w:t>
+        <w:t xml:space="preserve">Стадия </w:t>
       </w:r>
       <w:r>
         <w:rPr>
@@ -6048,7 +6067,14 @@
                 <w:b/>
                 <w:sz w:val="24"/>
               </w:rPr>
-              <w:t>Полнота выборки</w:t>
+              <w:t xml:space="preserve">Полнота </w:t>
+            </w:r>
+            <w:r>
+              <w:rPr>
+                <w:b/>
+                <w:sz w:val="24"/>
+              </w:rPr>
+              <w:t>выборки</w:t>
             </w:r>
           </w:p>
         </w:tc>
@@ -6306,13 +6332,7 @@
               <w:rPr>
                 <w:sz w:val="24"/>
               </w:rPr>
-              <w:t xml:space="preserve">49 </w:t>
-            </w:r>
-            <w:r>
-              <w:rPr>
-                <w:sz w:val="24"/>
-              </w:rPr>
-              <w:t>из 50</w:t>
+              <w:t>49 из 50</w:t>
             </w:r>
           </w:p>
         </w:tc>
@@ -6959,10 +6979,7 @@
         <w:t>oracle</w:t>
       </w:r>
       <w:r>
-        <w:t xml:space="preserve">, два прогона с разными моделями-ответчиками (потолок зависит от отвечающей модели, поэтому числа приведены </w:t>
-      </w:r>
-      <w:r>
-        <w:t>оба):</w:t>
+        <w:t>, два прогона с разными моделями-ответчиками (потолок зависит от отвечающей модели, поэтому числа приведены оба):</w:t>
       </w:r>
     </w:p>
     <w:tbl>
@@ -7371,10 +7388,10 @@
         <w:t>s</w:t>
       </w:r>
       <w:r>
-        <w:t>; такие клетки не засчитаны ни как верные, ни как неверные, и в таблице они вынесены отдельным столбцом. Второе: вопросы о предпочтениях дал</w:t>
-      </w:r>
-      <w:r>
-        <w:t xml:space="preserve">и ноль на всех вариантах в прогоне </w:t>
+        <w:t>; такие клетки не засчитаны ни как верные, ни как нев</w:t>
+      </w:r>
+      <w:r>
+        <w:t xml:space="preserve">ерные, и в таблице они вынесены отдельным столбцом. Второе: вопросы о предпочтениях дали ноль на всех вариантах в прогоне </w:t>
       </w:r>
       <w:r>
         <w:rPr>
@@ -7384,10 +7401,10 @@
         <w:t>oracle-50-1</w:t>
       </w:r>
       <w:r>
-        <w:t>, то есть этот тип вопросов нашим стендом пока не измеряется. Третье: замер не финальный, разница между графом и плоским журналом лежит внутри шума, и именно поэтому в основном тексте не делается вывода о прево</w:t>
-      </w:r>
-      <w:r>
-        <w:t>сходстве графа.</w:t>
+        <w:t>, то есть этот тип вопросов нашим стендом пока не измеряется. Третье: замер не финальный, разница между графом и плоским жу</w:t>
+      </w:r>
+      <w:r>
+        <w:t>рналом лежит внутри шума, и именно поэтому в основном тексте не делается вывода о превосходстве графа.</w:t>
       </w:r>
     </w:p>
     <w:p>
@@ -7400,7 +7417,7 @@
         <w:pStyle w:val="1"/>
         <w:jc w:val="right"/>
       </w:pPr>
-      <w:bookmarkStart w:id="28" w:name="_Toc240979897"/>
+      <w:bookmarkStart w:id="28" w:name="_Toc240988222"/>
       <w:r>
         <w:rPr>
           <w:rFonts w:ascii="Times New Roman" w:hAnsi="Times New Roman"/>
@@ -7648,7 +7665,13 @@
               <w:rPr>
                 <w:sz w:val="24"/>
               </w:rPr>
-              <w:t>развёрнуто, в рабочем режиме +27,0 процента (хуже)</w:t>
+              <w:t xml:space="preserve">развёрнуто, в рабочем режиме +27,0 процента </w:t>
+            </w:r>
+            <w:r>
+              <w:rPr>
+                <w:sz w:val="24"/>
+              </w:rPr>
+              <w:t>(хуже)</w:t>
             </w:r>
           </w:p>
         </w:tc>
@@ -7796,13 +7819,7 @@
               <w:rPr>
                 <w:sz w:val="24"/>
               </w:rPr>
-              <w:t xml:space="preserve">отказ по </w:t>
-            </w:r>
-            <w:r>
-              <w:rPr>
-                <w:sz w:val="24"/>
-              </w:rPr>
-              <w:t>доказательствам</w:t>
+              <w:t>отказ по доказательствам</w:t>
             </w:r>
           </w:p>
         </w:tc>
@@ -8024,7 +8041,13 @@
               <w:rPr>
                 <w:sz w:val="24"/>
               </w:rPr>
-              <w:t>развёрнуто по одному прогону (минус 3,4), при трёх прогонах +4,0</w:t>
+              <w:t xml:space="preserve">развёрнуто по одному прогону (минус 3,4), при </w:t>
+            </w:r>
+            <w:r>
+              <w:rPr>
+                <w:sz w:val="24"/>
+              </w:rPr>
+              <w:t>трёх прогонах +4,0</w:t>
             </w:r>
           </w:p>
         </w:tc>
@@ -8172,13 +8195,7 @@
               <w:rPr>
                 <w:sz w:val="24"/>
               </w:rPr>
-              <w:t xml:space="preserve">развёрнуто: минус 13,3 на поиске, </w:t>
-            </w:r>
-            <w:r>
-              <w:rPr>
-                <w:sz w:val="24"/>
-              </w:rPr>
-              <w:t>минус 28,5 на отложенных задачах</w:t>
+              <w:t>развёрнуто: минус 13,3 на поиске, минус 28,5 на отложенных задачах</w:t>
             </w:r>
           </w:p>
         </w:tc>
@@ -8195,7 +8212,7 @@
         <w:pStyle w:val="1"/>
         <w:jc w:val="right"/>
       </w:pPr>
-      <w:bookmarkStart w:id="29" w:name="_Toc240979898"/>
+      <w:bookmarkStart w:id="29" w:name="_Toc240988223"/>
       <w:r>
         <w:rPr>
           <w:rFonts w:ascii="Times New Roman" w:hAnsi="Times New Roman"/>
@@ -8207,7 +8224,10 @@
     </w:p>
     <w:p>
       <w:r>
-        <w:t>Все числа основного текста берутся из артефактов, которые создаются запуском кода проекта. Пути указаны относительно каталога проекта.</w:t>
+        <w:t>Все числа основного текста берутся из артефактов, которые создаются запуском кода проекта.</w:t>
+      </w:r>
+      <w:r>
+        <w:t xml:space="preserve"> Пути указаны относительно каталога проекта.</w:t>
       </w:r>
     </w:p>
     <w:tbl>
@@ -8280,13 +8300,7 @@
               <w:rPr>
                 <w:sz w:val="24"/>
               </w:rPr>
-              <w:t>Улучше</w:t>
-            </w:r>
-            <w:r>
-              <w:rPr>
-                <w:sz w:val="24"/>
-              </w:rPr>
-              <w:t>ние в мирах (пункт 4.2)</w:t>
+              <w:t>Улучшение в мирах (пункт 4.2)</w:t>
             </w:r>
           </w:p>
         </w:tc>
@@ -8342,7 +8356,13 @@
               <w:rPr>
                 <w:sz w:val="24"/>
               </w:rPr>
-              <w:t>python -m metrics.build_table против живого стека</w:t>
+              <w:t xml:space="preserve">python -m </w:t>
+            </w:r>
+            <w:r>
+              <w:rPr>
+                <w:sz w:val="24"/>
+              </w:rPr>
+              <w:t>metrics.build_table против живого стека</w:t>
             </w:r>
           </w:p>
         </w:tc>
@@ -8380,13 +8400,7 @@
               <w:rPr>
                 <w:sz w:val="24"/>
               </w:rPr>
-              <w:t xml:space="preserve">python </w:t>
-            </w:r>
-            <w:r>
-              <w:rPr>
-                <w:sz w:val="24"/>
-              </w:rPr>
-              <w:t>harness/rsi.py --reference и python harness/report.py</w:t>
+              <w:t>python harness/rsi.py --reference и python harness/report.py</w:t>
             </w:r>
           </w:p>
         </w:tc>
@@ -8424,7 +8438,13 @@
               <w:rPr>
                 <w:sz w:val="24"/>
               </w:rPr>
-              <w:t>python harness/rsi.py --show --recheck --ledger; записи в harness/lab/rsi/round-*.json</w:t>
+              <w:t>python harness/rsi.py --show --recheck --ledger; записи в harness/l</w:t>
+            </w:r>
+            <w:r>
+              <w:rPr>
+                <w:sz w:val="24"/>
+              </w:rPr>
+              <w:t>ab/rsi/round-*.json</w:t>
             </w:r>
           </w:p>
         </w:tc>
@@ -8462,13 +8482,7 @@
               <w:rPr>
                 <w:sz w:val="24"/>
               </w:rPr>
-              <w:t>python bench/memory/run.py --stage s --questio</w:t>
-            </w:r>
-            <w:r>
-              <w:rPr>
-                <w:sz w:val="24"/>
-              </w:rPr>
-              <w:t>ns 50 --cap 100 --k 5; отчёты в каталоге прогонов</w:t>
+              <w:t>python bench/memory/run.py --stage s --questions 50 --cap 100 --k 5; отчёты в каталоге прогонов</w:t>
             </w:r>
           </w:p>
         </w:tc>
@@ -8526,7 +8540,13 @@
               <w:rPr>
                 <w:sz w:val="24"/>
               </w:rPr>
-              <w:t>Отсутствие исполнений в повторе</w:t>
+              <w:t xml:space="preserve">Отсутствие </w:t>
+            </w:r>
+            <w:r>
+              <w:rPr>
+                <w:sz w:val="24"/>
+              </w:rPr>
+              <w:t>исполнений в повторе</w:t>
             </w:r>
           </w:p>
         </w:tc>
@@ -8544,13 +8564,7 @@
               <w:rPr>
                 <w:sz w:val="24"/>
               </w:rPr>
-              <w:t>python -m pytest tests/test_replay_offline.py -q</w:t>
-            </w:r>
-            <w:r>
-              <w:rPr>
-                <w:sz w:val="24"/>
-              </w:rPr>
-              <w:t xml:space="preserve"> (шаг мира подменён функцией, обязанной возбуждать исключение)</w:t>
+              <w:t>python -m pytest tests/test_replay_offline.py -q (шаг мира подменён функцией, обязанной возбуждать исключение)</w:t>
             </w:r>
           </w:p>
         </w:tc>
@@ -8588,7 +8602,13 @@
               <w:rPr>
                 <w:sz w:val="24"/>
               </w:rPr>
-              <w:t>python -m pytest tests -q --ignore=tests/test_core_loop.py и python -m pytest harness/tests -q: 109 и 19 проверок, все проходят без обращения к сети</w:t>
+              <w:t xml:space="preserve">python -m pytest tests -q --ignore=tests/test_core_loop.py и python -m pytest harness/tests </w:t>
+            </w:r>
+            <w:r>
+              <w:rPr>
+                <w:sz w:val="24"/>
+              </w:rPr>
+              <w:t>-q: 109 и 19 проверок, все проходят без обращения к сети</w:t>
             </w:r>
           </w:p>
         </w:tc>
@@ -8605,7 +8625,7 @@
         <w:pStyle w:val="1"/>
         <w:jc w:val="right"/>
       </w:pPr>
-      <w:bookmarkStart w:id="30" w:name="_Toc240979899"/>
+      <w:bookmarkStart w:id="30" w:name="_Toc240988224"/>
       <w:r>
         <w:rPr>
           <w:rFonts w:ascii="Times New Roman" w:hAnsi="Times New Roman"/>
@@ -8718,10 +8738,10 @@
     </w:p>
     <w:p>
       <w:r>
-        <w:t>Рисунок Г.2. Лента организации: предложения исследователя, решение менеджера, созданные рабочие копии, пакеты изменений и причины ос</w:t>
-      </w:r>
-      <w:r>
-        <w:t>тановок.</w:t>
+        <w:t xml:space="preserve">Рисунок Г.2. Лента организации: предложения исследователя, решение </w:t>
+      </w:r>
+      <w:r>
+        <w:t>менеджера, созданные рабочие копии, пакеты изменений и причины остановок.</w:t>
       </w:r>
     </w:p>
     <w:p>
@@ -8828,10 +8848,10 @@
     </w:p>
     <w:p>
       <w:r>
-        <w:t>Рисунок Г.4. Раздел «что здесь доказывается»: перечень утверждений, подтверждённых текущим прогоном, отдельно от утверждений, которые ещё не под</w:t>
-      </w:r>
-      <w:r>
-        <w:t>тверждены.</w:t>
+        <w:t>Рисунок Г.4. Раздел «что здесь доказывается»: перечень утверждений, подтверждён</w:t>
+      </w:r>
+      <w:r>
+        <w:t>ных текущим прогоном, отдельно от утверждений, которые ещё не подтверждены.</w:t>
       </w:r>
     </w:p>
     <w:p>
@@ -8846,10 +8866,10 @@
         <w:t>scripts/pz-shots.py</w:t>
       </w:r>
       <w:r>
-        <w:t>, поэтому их можно пересобрать заново, когда панель изменится. Рисунок роста счёта в мире в работу не включён: на момент съёмки он показывал пустое состояние, потому что па</w:t>
-      </w:r>
-      <w:r>
-        <w:t>нель ищет эпизоды деплоя в графе и не находит их там, где они записаны. Это дефект панели, а не отсутствие данных: сами раунды приведены таблицей в приложении Б.</w:t>
+        <w:t>, поэтому их можно пересобрать заново, когда панель изменится. Рисунок роста счёта в мире в работу не включ</w:t>
+      </w:r>
+      <w:r>
+        <w:t>ён: на момент съёмки он показывал пустое состояние, потому что панель ищет эпизоды деплоя в графе и не находит их там, где они записаны. Это дефект панели, а не отсутствие данных: сами раунды приведены таблицей в приложении Б.</w:t>
       </w:r>
     </w:p>
     <w:sectPr>
@@ -20541,7 +20561,7 @@
     <w:autoRedefine/>
     <w:uiPriority w:val="39"/>
     <w:unhideWhenUsed/>
-    <w:rsid w:val="00AD5251"/>
+    <w:rsid w:val="005D595A"/>
     <w:pPr>
       <w:spacing w:after="100"/>
     </w:pPr>
@@ -20553,7 +20573,7 @@
     <w:autoRedefine/>
     <w:uiPriority w:val="39"/>
     <w:unhideWhenUsed/>
-    <w:rsid w:val="00AD5251"/>
+    <w:rsid w:val="005D595A"/>
     <w:pPr>
       <w:spacing w:after="100"/>
       <w:ind w:left="280"/>
@@ -20564,7 +20584,7 @@
     <w:basedOn w:val="a2"/>
     <w:uiPriority w:val="99"/>
     <w:unhideWhenUsed/>
-    <w:rsid w:val="00AD5251"/>
+    <w:rsid w:val="005D595A"/>
     <w:rPr>
       <w:color w:val="0000FF" w:themeColor="hyperlink"/>
       <w:u w:val="single"/>
@@ -20898,7 +20918,7 @@
 </file>
 
 <file path=customXml/itemProps1.xml><?xml version="1.0" encoding="utf-8"?>
-<ds:datastoreItem xmlns:ds="http://schemas.openxmlformats.org/officeDocument/2006/customXml" ds:itemID="{DF3F9431-8C3F-4648-8D2C-99C58800C510}">
+<ds:datastoreItem xmlns:ds="http://schemas.openxmlformats.org/officeDocument/2006/customXml" ds:itemID="{0112E5CF-A73F-40ED-8A0F-3CB88CE8BEED}">
   <ds:schemaRefs>
     <ds:schemaRef ds:uri="http://schemas.openxmlformats.org/officeDocument/2006/bibliography"/>
   </ds:schemaRefs>

</xml_diff>

<commit_message>
oneiro: five servers and seventy-eight tools, because PATH was the whole problem
The host now starts our memory, the owner's own memory store, the workspace knowledge
base, web search and a real browser: 5/5 servers ready, 78 tools, stable across
restarts. Every npx-based server had been dying with WinError 2 while npx sat on the
system; host-wire.py now resolves commands to absolute paths and passes the directory
through PATH, and it prunes entries it added earlier that are no longer chosen.

Chroma was left out after it spent 200+ MB of downloads and missed the handshake.
Servers that can send outward wait until the approval channel is wired into them.

The paper gains section 3.5 on how the assistant sits inside a ready host over the
standard protocol, and the builder refused my own em dash before it reached the
document, which is the guard doing its job.
</commit_message>
<xml_diff>
--- a/docs/pz/Пояснительная записка.docx
+++ b/docs/pz/Пояснительная записка.docx
@@ -149,7 +149,7 @@
         </w:rPr>
         <w:fldChar w:fldCharType="separate"/>
       </w:r>
-      <w:hyperlink w:anchor="_Toc240988195" w:history="1">
+      <w:hyperlink w:anchor="_Toc240990185" w:history="1">
         <w:r>
           <w:rPr>
             <w:rStyle w:val="aff8"/>
@@ -177,7 +177,7 @@
             <w:noProof/>
             <w:webHidden/>
           </w:rPr>
-          <w:instrText xml:space="preserve"> PAGEREF _Toc240988195 \h </w:instrText>
+          <w:instrText xml:space="preserve"> PAGEREF _Toc240990185 \h </w:instrText>
         </w:r>
         <w:r>
           <w:rPr>
@@ -222,7 +222,7 @@
           <w:lang w:val="ru-RU" w:eastAsia="ru-RU"/>
         </w:rPr>
       </w:pPr>
-      <w:hyperlink w:anchor="_Toc240988196" w:history="1">
+      <w:hyperlink w:anchor="_Toc240990186" w:history="1">
         <w:r>
           <w:rPr>
             <w:rStyle w:val="aff8"/>
@@ -250,7 +250,7 @@
             <w:noProof/>
             <w:webHidden/>
           </w:rPr>
-          <w:instrText xml:space="preserve"> PAGEREF _Toc240988196 \h </w:instrText>
+          <w:instrText xml:space="preserve"> PAGEREF _Toc240990186 \h </w:instrText>
         </w:r>
         <w:r>
           <w:rPr>
@@ -295,7 +295,7 @@
           <w:lang w:val="ru-RU" w:eastAsia="ru-RU"/>
         </w:rPr>
       </w:pPr>
-      <w:hyperlink w:anchor="_Toc240988197" w:history="1">
+      <w:hyperlink w:anchor="_Toc240990187" w:history="1">
         <w:r>
           <w:rPr>
             <w:rStyle w:val="aff8"/>
@@ -323,7 +323,7 @@
             <w:noProof/>
             <w:webHidden/>
           </w:rPr>
-          <w:instrText xml:space="preserve"> PAGEREF _Toc240988197 \h </w:instrText>
+          <w:instrText xml:space="preserve"> PAGEREF _Toc240990187 \h </w:instrText>
         </w:r>
         <w:r>
           <w:rPr>
@@ -368,7 +368,7 @@
           <w:lang w:val="ru-RU" w:eastAsia="ru-RU"/>
         </w:rPr>
       </w:pPr>
-      <w:hyperlink w:anchor="_Toc240988198" w:history="1">
+      <w:hyperlink w:anchor="_Toc240990188" w:history="1">
         <w:r>
           <w:rPr>
             <w:rStyle w:val="aff8"/>
@@ -396,7 +396,7 @@
             <w:noProof/>
             <w:webHidden/>
           </w:rPr>
-          <w:instrText xml:space="preserve"> PAGEREF _Toc240988198 \h </w:instrText>
+          <w:instrText xml:space="preserve"> PAGEREF _Toc240990188 \h </w:instrText>
         </w:r>
         <w:r>
           <w:rPr>
@@ -441,7 +441,7 @@
           <w:lang w:val="ru-RU" w:eastAsia="ru-RU"/>
         </w:rPr>
       </w:pPr>
-      <w:hyperlink w:anchor="_Toc240988199" w:history="1">
+      <w:hyperlink w:anchor="_Toc240990189" w:history="1">
         <w:r>
           <w:rPr>
             <w:rStyle w:val="aff8"/>
@@ -469,7 +469,7 @@
             <w:noProof/>
             <w:webHidden/>
           </w:rPr>
-          <w:instrText xml:space="preserve"> PAGEREF _Toc240988199 \h </w:instrText>
+          <w:instrText xml:space="preserve"> PAGEREF _Toc240990189 \h </w:instrText>
         </w:r>
         <w:r>
           <w:rPr>
@@ -514,7 +514,7 @@
           <w:lang w:val="ru-RU" w:eastAsia="ru-RU"/>
         </w:rPr>
       </w:pPr>
-      <w:hyperlink w:anchor="_Toc240988200" w:history="1">
+      <w:hyperlink w:anchor="_Toc240990190" w:history="1">
         <w:r>
           <w:rPr>
             <w:rStyle w:val="aff8"/>
@@ -542,7 +542,7 @@
             <w:noProof/>
             <w:webHidden/>
           </w:rPr>
-          <w:instrText xml:space="preserve"> PAGEREF _Toc240988200 \h </w:instrText>
+          <w:instrText xml:space="preserve"> PAGEREF _Toc240990190 \h </w:instrText>
         </w:r>
         <w:r>
           <w:rPr>
@@ -587,7 +587,7 @@
           <w:lang w:val="ru-RU" w:eastAsia="ru-RU"/>
         </w:rPr>
       </w:pPr>
-      <w:hyperlink w:anchor="_Toc240988201" w:history="1">
+      <w:hyperlink w:anchor="_Toc240990191" w:history="1">
         <w:r>
           <w:rPr>
             <w:rStyle w:val="aff8"/>
@@ -615,7 +615,7 @@
             <w:noProof/>
             <w:webHidden/>
           </w:rPr>
-          <w:instrText xml:space="preserve"> PAGEREF _Toc240988201 \h </w:instrText>
+          <w:instrText xml:space="preserve"> PAGEREF _Toc240990191 \h </w:instrText>
         </w:r>
         <w:r>
           <w:rPr>
@@ -660,7 +660,7 @@
           <w:lang w:val="ru-RU" w:eastAsia="ru-RU"/>
         </w:rPr>
       </w:pPr>
-      <w:hyperlink w:anchor="_Toc240988202" w:history="1">
+      <w:hyperlink w:anchor="_Toc240990192" w:history="1">
         <w:r>
           <w:rPr>
             <w:rStyle w:val="aff8"/>
@@ -688,7 +688,7 @@
             <w:noProof/>
             <w:webHidden/>
           </w:rPr>
-          <w:instrText xml:space="preserve"> PAGEREF _Toc240988202 \h </w:instrText>
+          <w:instrText xml:space="preserve"> PAGEREF _Toc240990192 \h </w:instrText>
         </w:r>
         <w:r>
           <w:rPr>
@@ -733,7 +733,7 @@
           <w:lang w:val="ru-RU" w:eastAsia="ru-RU"/>
         </w:rPr>
       </w:pPr>
-      <w:hyperlink w:anchor="_Toc240988203" w:history="1">
+      <w:hyperlink w:anchor="_Toc240990193" w:history="1">
         <w:r>
           <w:rPr>
             <w:rStyle w:val="aff8"/>
@@ -761,7 +761,7 @@
             <w:noProof/>
             <w:webHidden/>
           </w:rPr>
-          <w:instrText xml:space="preserve"> PAGEREF _Toc240988203 \h </w:instrText>
+          <w:instrText xml:space="preserve"> PAGEREF _Toc240990193 \h </w:instrText>
         </w:r>
         <w:r>
           <w:rPr>
@@ -806,7 +806,7 @@
           <w:lang w:val="ru-RU" w:eastAsia="ru-RU"/>
         </w:rPr>
       </w:pPr>
-      <w:hyperlink w:anchor="_Toc240988204" w:history="1">
+      <w:hyperlink w:anchor="_Toc240990194" w:history="1">
         <w:r>
           <w:rPr>
             <w:rStyle w:val="aff8"/>
@@ -834,7 +834,7 @@
             <w:noProof/>
             <w:webHidden/>
           </w:rPr>
-          <w:instrText xml:space="preserve"> PAGEREF _Toc240988204 \h </w:instrText>
+          <w:instrText xml:space="preserve"> PAGEREF _Toc240990194 \h </w:instrText>
         </w:r>
         <w:r>
           <w:rPr>
@@ -879,7 +879,7 @@
           <w:lang w:val="ru-RU" w:eastAsia="ru-RU"/>
         </w:rPr>
       </w:pPr>
-      <w:hyperlink w:anchor="_Toc240988205" w:history="1">
+      <w:hyperlink w:anchor="_Toc240990195" w:history="1">
         <w:r>
           <w:rPr>
             <w:rStyle w:val="aff8"/>
@@ -907,7 +907,7 @@
             <w:noProof/>
             <w:webHidden/>
           </w:rPr>
-          <w:instrText xml:space="preserve"> PAGEREF _Toc240988205 \h </w:instrText>
+          <w:instrText xml:space="preserve"> PAGEREF _Toc240990195 \h </w:instrText>
         </w:r>
         <w:r>
           <w:rPr>
@@ -952,7 +952,7 @@
           <w:lang w:val="ru-RU" w:eastAsia="ru-RU"/>
         </w:rPr>
       </w:pPr>
-      <w:hyperlink w:anchor="_Toc240988206" w:history="1">
+      <w:hyperlink w:anchor="_Toc240990196" w:history="1">
         <w:r>
           <w:rPr>
             <w:rStyle w:val="aff8"/>
@@ -980,7 +980,7 @@
             <w:noProof/>
             <w:webHidden/>
           </w:rPr>
-          <w:instrText xml:space="preserve"> PAGEREF _Toc240988206 \h </w:instrText>
+          <w:instrText xml:space="preserve"> PAGEREF _Toc240990196 \h </w:instrText>
         </w:r>
         <w:r>
           <w:rPr>
@@ -1025,7 +1025,7 @@
           <w:lang w:val="ru-RU" w:eastAsia="ru-RU"/>
         </w:rPr>
       </w:pPr>
-      <w:hyperlink w:anchor="_Toc240988207" w:history="1">
+      <w:hyperlink w:anchor="_Toc240990197" w:history="1">
         <w:r>
           <w:rPr>
             <w:rStyle w:val="aff8"/>
@@ -1053,7 +1053,7 @@
             <w:noProof/>
             <w:webHidden/>
           </w:rPr>
-          <w:instrText xml:space="preserve"> PAGEREF _Toc240988207 \h </w:instrText>
+          <w:instrText xml:space="preserve"> PAGEREF _Toc240990197 \h </w:instrText>
         </w:r>
         <w:r>
           <w:rPr>
@@ -1098,7 +1098,7 @@
           <w:lang w:val="ru-RU" w:eastAsia="ru-RU"/>
         </w:rPr>
       </w:pPr>
-      <w:hyperlink w:anchor="_Toc240988208" w:history="1">
+      <w:hyperlink w:anchor="_Toc240990198" w:history="1">
         <w:r>
           <w:rPr>
             <w:rStyle w:val="aff8"/>
@@ -1126,7 +1126,7 @@
             <w:noProof/>
             <w:webHidden/>
           </w:rPr>
-          <w:instrText xml:space="preserve"> PAGEREF _Toc240988208 \h </w:instrText>
+          <w:instrText xml:space="preserve"> PAGEREF _Toc240990198 \h </w:instrText>
         </w:r>
         <w:r>
           <w:rPr>
@@ -1171,7 +1171,7 @@
           <w:lang w:val="ru-RU" w:eastAsia="ru-RU"/>
         </w:rPr>
       </w:pPr>
-      <w:hyperlink w:anchor="_Toc240988209" w:history="1">
+      <w:hyperlink w:anchor="_Toc240990199" w:history="1">
         <w:r>
           <w:rPr>
             <w:rStyle w:val="aff8"/>
@@ -1199,7 +1199,7 @@
             <w:noProof/>
             <w:webHidden/>
           </w:rPr>
-          <w:instrText xml:space="preserve"> PAGEREF _Toc240988209 \h </w:instrText>
+          <w:instrText xml:space="preserve"> PAGEREF _Toc240990199 \h </w:instrText>
         </w:r>
         <w:r>
           <w:rPr>
@@ -1244,7 +1244,7 @@
           <w:lang w:val="ru-RU" w:eastAsia="ru-RU"/>
         </w:rPr>
       </w:pPr>
-      <w:hyperlink w:anchor="_Toc240988210" w:history="1">
+      <w:hyperlink w:anchor="_Toc240990200" w:history="1">
         <w:r>
           <w:rPr>
             <w:rStyle w:val="aff8"/>
@@ -1272,7 +1272,7 @@
             <w:noProof/>
             <w:webHidden/>
           </w:rPr>
-          <w:instrText xml:space="preserve"> PAGEREF _Toc240988210 \h </w:instrText>
+          <w:instrText xml:space="preserve"> PAGEREF _Toc240990200 \h </w:instrText>
         </w:r>
         <w:r>
           <w:rPr>
@@ -1317,7 +1317,7 @@
           <w:lang w:val="ru-RU" w:eastAsia="ru-RU"/>
         </w:rPr>
       </w:pPr>
-      <w:hyperlink w:anchor="_Toc240988211" w:history="1">
+      <w:hyperlink w:anchor="_Toc240990201" w:history="1">
         <w:r>
           <w:rPr>
             <w:rStyle w:val="aff8"/>
@@ -1345,7 +1345,7 @@
             <w:noProof/>
             <w:webHidden/>
           </w:rPr>
-          <w:instrText xml:space="preserve"> PAGEREF _Toc240988211 \h </w:instrText>
+          <w:instrText xml:space="preserve"> PAGEREF _Toc240990201 \h </w:instrText>
         </w:r>
         <w:r>
           <w:rPr>
@@ -1390,7 +1390,7 @@
           <w:lang w:val="ru-RU" w:eastAsia="ru-RU"/>
         </w:rPr>
       </w:pPr>
-      <w:hyperlink w:anchor="_Toc240988212" w:history="1">
+      <w:hyperlink w:anchor="_Toc240990202" w:history="1">
         <w:r>
           <w:rPr>
             <w:rStyle w:val="aff8"/>
@@ -1418,7 +1418,80 @@
             <w:noProof/>
             <w:webHidden/>
           </w:rPr>
-          <w:instrText xml:space="preserve"> PAGEREF _Toc240988212 \h </w:instrText>
+          <w:instrText xml:space="preserve"> PAGEREF _Toc240990202 \h </w:instrText>
+        </w:r>
+        <w:r>
+          <w:rPr>
+            <w:noProof/>
+            <w:webHidden/>
+          </w:rPr>
+        </w:r>
+        <w:r>
+          <w:rPr>
+            <w:noProof/>
+            <w:webHidden/>
+          </w:rPr>
+          <w:fldChar w:fldCharType="separate"/>
+        </w:r>
+        <w:r>
+          <w:rPr>
+            <w:noProof/>
+            <w:webHidden/>
+          </w:rPr>
+          <w:t>13</w:t>
+        </w:r>
+        <w:r>
+          <w:rPr>
+            <w:noProof/>
+            <w:webHidden/>
+          </w:rPr>
+          <w:fldChar w:fldCharType="end"/>
+        </w:r>
+      </w:hyperlink>
+    </w:p>
+    <w:p>
+      <w:pPr>
+        <w:pStyle w:val="2c"/>
+        <w:tabs>
+          <w:tab w:val="right" w:leader="dot" w:pos="9628"/>
+        </w:tabs>
+        <w:spacing w:after="0" w:line="240" w:lineRule="auto"/>
+        <w:rPr>
+          <w:rFonts w:asciiTheme="minorHAnsi" w:eastAsiaTheme="minorEastAsia" w:hAnsiTheme="minorHAnsi"/>
+          <w:noProof/>
+          <w:sz w:val="22"/>
+          <w:lang w:val="ru-RU" w:eastAsia="ru-RU"/>
+        </w:rPr>
+      </w:pPr>
+      <w:hyperlink w:anchor="_Toc240990203" w:history="1">
+        <w:r>
+          <w:rPr>
+            <w:rStyle w:val="aff8"/>
+            <w:rFonts w:eastAsiaTheme="majorEastAsia"/>
+            <w:noProof/>
+          </w:rPr>
+          <w:t>3.5. Как система встраивается в готовую обвязку</w:t>
+        </w:r>
+        <w:r>
+          <w:rPr>
+            <w:noProof/>
+            <w:webHidden/>
+          </w:rPr>
+          <w:tab/>
+        </w:r>
+        <w:r>
+          <w:rPr>
+            <w:noProof/>
+            <w:webHidden/>
+          </w:rPr>
+          <w:fldChar w:fldCharType="begin"/>
+        </w:r>
+        <w:r>
+          <w:rPr>
+            <w:noProof/>
+            <w:webHidden/>
+          </w:rPr>
+          <w:instrText xml:space="preserve"> PAGEREF _Toc240990203 \h </w:instrText>
         </w:r>
         <w:r>
           <w:rPr>
@@ -1463,7 +1536,7 @@
           <w:lang w:val="ru-RU" w:eastAsia="ru-RU"/>
         </w:rPr>
       </w:pPr>
-      <w:hyperlink w:anchor="_Toc240988213" w:history="1">
+      <w:hyperlink w:anchor="_Toc240990204" w:history="1">
         <w:r>
           <w:rPr>
             <w:rStyle w:val="aff8"/>
@@ -1491,7 +1564,7 @@
             <w:noProof/>
             <w:webHidden/>
           </w:rPr>
-          <w:instrText xml:space="preserve"> PAGEREF _Toc240988213 \h </w:instrText>
+          <w:instrText xml:space="preserve"> PAGEREF _Toc240990204 \h </w:instrText>
         </w:r>
         <w:r>
           <w:rPr>
@@ -1511,7 +1584,7 @@
             <w:noProof/>
             <w:webHidden/>
           </w:rPr>
-          <w:t>13</w:t>
+          <w:t>14</w:t>
         </w:r>
         <w:r>
           <w:rPr>
@@ -1536,7 +1609,7 @@
           <w:lang w:val="ru-RU" w:eastAsia="ru-RU"/>
         </w:rPr>
       </w:pPr>
-      <w:hyperlink w:anchor="_Toc240988214" w:history="1">
+      <w:hyperlink w:anchor="_Toc240990205" w:history="1">
         <w:r>
           <w:rPr>
             <w:rStyle w:val="aff8"/>
@@ -1564,7 +1637,7 @@
             <w:noProof/>
             <w:webHidden/>
           </w:rPr>
-          <w:instrText xml:space="preserve"> PAGEREF _Toc240988214 \h </w:instrText>
+          <w:instrText xml:space="preserve"> PAGEREF _Toc240990205 \h </w:instrText>
         </w:r>
         <w:r>
           <w:rPr>
@@ -1584,7 +1657,7 @@
             <w:noProof/>
             <w:webHidden/>
           </w:rPr>
-          <w:t>13</w:t>
+          <w:t>14</w:t>
         </w:r>
         <w:r>
           <w:rPr>
@@ -1609,7 +1682,7 @@
           <w:lang w:val="ru-RU" w:eastAsia="ru-RU"/>
         </w:rPr>
       </w:pPr>
-      <w:hyperlink w:anchor="_Toc240988215" w:history="1">
+      <w:hyperlink w:anchor="_Toc240990206" w:history="1">
         <w:r>
           <w:rPr>
             <w:rStyle w:val="aff8"/>
@@ -1637,7 +1710,7 @@
             <w:noProof/>
             <w:webHidden/>
           </w:rPr>
-          <w:instrText xml:space="preserve"> PAGEREF _Toc240988215 \h </w:instrText>
+          <w:instrText xml:space="preserve"> PAGEREF _Toc240990206 \h </w:instrText>
         </w:r>
         <w:r>
           <w:rPr>
@@ -1657,7 +1730,7 @@
             <w:noProof/>
             <w:webHidden/>
           </w:rPr>
-          <w:t>14</w:t>
+          <w:t>15</w:t>
         </w:r>
         <w:r>
           <w:rPr>
@@ -1682,7 +1755,7 @@
           <w:lang w:val="ru-RU" w:eastAsia="ru-RU"/>
         </w:rPr>
       </w:pPr>
-      <w:hyperlink w:anchor="_Toc240988216" w:history="1">
+      <w:hyperlink w:anchor="_Toc240990207" w:history="1">
         <w:r>
           <w:rPr>
             <w:rStyle w:val="aff8"/>
@@ -1710,7 +1783,7 @@
             <w:noProof/>
             <w:webHidden/>
           </w:rPr>
-          <w:instrText xml:space="preserve"> PAGEREF _Toc240988216 \h </w:instrText>
+          <w:instrText xml:space="preserve"> PAGEREF _Toc240990207 \h </w:instrText>
         </w:r>
         <w:r>
           <w:rPr>
@@ -1755,7 +1828,7 @@
           <w:lang w:val="ru-RU" w:eastAsia="ru-RU"/>
         </w:rPr>
       </w:pPr>
-      <w:hyperlink w:anchor="_Toc240988217" w:history="1">
+      <w:hyperlink w:anchor="_Toc240990208" w:history="1">
         <w:r>
           <w:rPr>
             <w:rStyle w:val="aff8"/>
@@ -1783,7 +1856,7 @@
             <w:noProof/>
             <w:webHidden/>
           </w:rPr>
-          <w:instrText xml:space="preserve"> PAGEREF _Toc240988217 \h </w:instrText>
+          <w:instrText xml:space="preserve"> PAGEREF _Toc240990208 \h </w:instrText>
         </w:r>
         <w:r>
           <w:rPr>
@@ -1828,7 +1901,7 @@
           <w:lang w:val="ru-RU" w:eastAsia="ru-RU"/>
         </w:rPr>
       </w:pPr>
-      <w:hyperlink w:anchor="_Toc240988218" w:history="1">
+      <w:hyperlink w:anchor="_Toc240990209" w:history="1">
         <w:r>
           <w:rPr>
             <w:rStyle w:val="aff8"/>
@@ -1856,7 +1929,7 @@
             <w:noProof/>
             <w:webHidden/>
           </w:rPr>
-          <w:instrText xml:space="preserve"> PAGEREF _Toc240988218 \h </w:instrText>
+          <w:instrText xml:space="preserve"> PAGEREF _Toc240990209 \h </w:instrText>
         </w:r>
         <w:r>
           <w:rPr>
@@ -1901,7 +1974,7 @@
           <w:lang w:val="ru-RU" w:eastAsia="ru-RU"/>
         </w:rPr>
       </w:pPr>
-      <w:hyperlink w:anchor="_Toc240988219" w:history="1">
+      <w:hyperlink w:anchor="_Toc240990210" w:history="1">
         <w:r>
           <w:rPr>
             <w:rStyle w:val="aff8"/>
@@ -1929,7 +2002,7 @@
             <w:noProof/>
             <w:webHidden/>
           </w:rPr>
-          <w:instrText xml:space="preserve"> PAGEREF _Toc240988219 \h </w:instrText>
+          <w:instrText xml:space="preserve"> PAGEREF _Toc240990210 \h </w:instrText>
         </w:r>
         <w:r>
           <w:rPr>
@@ -1949,7 +2022,7 @@
             <w:noProof/>
             <w:webHidden/>
           </w:rPr>
-          <w:t>17</w:t>
+          <w:t>18</w:t>
         </w:r>
         <w:r>
           <w:rPr>
@@ -1974,7 +2047,7 @@
           <w:lang w:val="ru-RU" w:eastAsia="ru-RU"/>
         </w:rPr>
       </w:pPr>
-      <w:hyperlink w:anchor="_Toc240988220" w:history="1">
+      <w:hyperlink w:anchor="_Toc240990211" w:history="1">
         <w:r>
           <w:rPr>
             <w:rStyle w:val="aff8"/>
@@ -2002,7 +2075,7 @@
             <w:noProof/>
             <w:webHidden/>
           </w:rPr>
-          <w:instrText xml:space="preserve"> PAGEREF _Toc240988220 \h </w:instrText>
+          <w:instrText xml:space="preserve"> PAGEREF _Toc240990211 \h </w:instrText>
         </w:r>
         <w:r>
           <w:rPr>
@@ -2047,7 +2120,7 @@
           <w:lang w:val="ru-RU" w:eastAsia="ru-RU"/>
         </w:rPr>
       </w:pPr>
-      <w:hyperlink w:anchor="_Toc240988221" w:history="1">
+      <w:hyperlink w:anchor="_Toc240990212" w:history="1">
         <w:r>
           <w:rPr>
             <w:rStyle w:val="aff8"/>
@@ -2075,7 +2148,7 @@
             <w:noProof/>
             <w:webHidden/>
           </w:rPr>
-          <w:instrText xml:space="preserve"> PAGEREF _Toc240988221 \h </w:instrText>
+          <w:instrText xml:space="preserve"> PAGEREF _Toc240990212 \h </w:instrText>
         </w:r>
         <w:r>
           <w:rPr>
@@ -2095,7 +2168,7 @@
             <w:noProof/>
             <w:webHidden/>
           </w:rPr>
-          <w:t>20</w:t>
+          <w:t>21</w:t>
         </w:r>
         <w:r>
           <w:rPr>
@@ -2120,7 +2193,7 @@
           <w:lang w:val="ru-RU" w:eastAsia="ru-RU"/>
         </w:rPr>
       </w:pPr>
-      <w:hyperlink w:anchor="_Toc240988222" w:history="1">
+      <w:hyperlink w:anchor="_Toc240990213" w:history="1">
         <w:r>
           <w:rPr>
             <w:rStyle w:val="aff8"/>
@@ -2148,7 +2221,7 @@
             <w:noProof/>
             <w:webHidden/>
           </w:rPr>
-          <w:instrText xml:space="preserve"> PAGEREF _Toc240988222 \h </w:instrText>
+          <w:instrText xml:space="preserve"> PAGEREF _Toc240990213 \h </w:instrText>
         </w:r>
         <w:r>
           <w:rPr>
@@ -2168,7 +2241,7 @@
             <w:noProof/>
             <w:webHidden/>
           </w:rPr>
-          <w:t>22</w:t>
+          <w:t>23</w:t>
         </w:r>
         <w:r>
           <w:rPr>
@@ -2193,7 +2266,7 @@
           <w:lang w:val="ru-RU" w:eastAsia="ru-RU"/>
         </w:rPr>
       </w:pPr>
-      <w:hyperlink w:anchor="_Toc240988223" w:history="1">
+      <w:hyperlink w:anchor="_Toc240990214" w:history="1">
         <w:r>
           <w:rPr>
             <w:rStyle w:val="aff8"/>
@@ -2221,7 +2294,7 @@
             <w:noProof/>
             <w:webHidden/>
           </w:rPr>
-          <w:instrText xml:space="preserve"> PAGEREF _Toc240988223 \h </w:instrText>
+          <w:instrText xml:space="preserve"> PAGEREF _Toc240990214 \h </w:instrText>
         </w:r>
         <w:r>
           <w:rPr>
@@ -2241,7 +2314,7 @@
             <w:noProof/>
             <w:webHidden/>
           </w:rPr>
-          <w:t>23</w:t>
+          <w:t>24</w:t>
         </w:r>
         <w:r>
           <w:rPr>
@@ -2266,7 +2339,7 @@
           <w:lang w:val="ru-RU" w:eastAsia="ru-RU"/>
         </w:rPr>
       </w:pPr>
-      <w:hyperlink w:anchor="_Toc240988224" w:history="1">
+      <w:hyperlink w:anchor="_Toc240990215" w:history="1">
         <w:r>
           <w:rPr>
             <w:rStyle w:val="aff8"/>
@@ -2294,7 +2367,7 @@
             <w:noProof/>
             <w:webHidden/>
           </w:rPr>
-          <w:instrText xml:space="preserve"> PAGEREF _Toc240988224 \h </w:instrText>
+          <w:instrText xml:space="preserve"> PAGEREF _Toc240990215 \h </w:instrText>
         </w:r>
         <w:r>
           <w:rPr>
@@ -2314,7 +2387,7 @@
             <w:noProof/>
             <w:webHidden/>
           </w:rPr>
-          <w:t>24</w:t>
+          <w:t>25</w:t>
         </w:r>
         <w:r>
           <w:rPr>
@@ -2352,7 +2425,7 @@
       <w:pPr>
         <w:pStyle w:val="1"/>
       </w:pPr>
-      <w:bookmarkStart w:id="1" w:name="_Toc240988195"/>
+      <w:bookmarkStart w:id="1" w:name="_Toc240990185"/>
       <w:r>
         <w:rPr>
           <w:rFonts w:ascii="Times New Roman" w:hAnsi="Times New Roman"/>
@@ -2553,7 +2626,7 @@
       <w:pPr>
         <w:pStyle w:val="1"/>
       </w:pPr>
-      <w:bookmarkStart w:id="2" w:name="_Toc240988196"/>
+      <w:bookmarkStart w:id="2" w:name="_Toc240990186"/>
       <w:r>
         <w:rPr>
           <w:rFonts w:ascii="Times New Roman" w:hAnsi="Times New Roman"/>
@@ -2572,7 +2645,7 @@
       <w:pPr>
         <w:pStyle w:val="21"/>
       </w:pPr>
-      <w:bookmarkStart w:id="3" w:name="_Toc240988197"/>
+      <w:bookmarkStart w:id="3" w:name="_Toc240990187"/>
       <w:r>
         <w:rPr>
           <w:rFonts w:ascii="Times New Roman" w:hAnsi="Times New Roman"/>
@@ -2613,7 +2686,7 @@
       <w:pPr>
         <w:pStyle w:val="21"/>
       </w:pPr>
-      <w:bookmarkStart w:id="4" w:name="_Toc240988198"/>
+      <w:bookmarkStart w:id="4" w:name="_Toc240990188"/>
       <w:r>
         <w:rPr>
           <w:rFonts w:ascii="Times New Roman" w:hAnsi="Times New Roman"/>
@@ -2700,7 +2773,7 @@
       <w:pPr>
         <w:pStyle w:val="21"/>
       </w:pPr>
-      <w:bookmarkStart w:id="5" w:name="_Toc240988199"/>
+      <w:bookmarkStart w:id="5" w:name="_Toc240990189"/>
       <w:r>
         <w:rPr>
           <w:rFonts w:ascii="Times New Roman" w:hAnsi="Times New Roman"/>
@@ -2724,7 +2797,7 @@
       <w:pPr>
         <w:pStyle w:val="21"/>
       </w:pPr>
-      <w:bookmarkStart w:id="6" w:name="_Toc240988200"/>
+      <w:bookmarkStart w:id="6" w:name="_Toc240990190"/>
       <w:r>
         <w:rPr>
           <w:rFonts w:ascii="Times New Roman" w:hAnsi="Times New Roman"/>
@@ -2755,7 +2828,7 @@
       <w:pPr>
         <w:pStyle w:val="21"/>
       </w:pPr>
-      <w:bookmarkStart w:id="7" w:name="_Toc240988201"/>
+      <w:bookmarkStart w:id="7" w:name="_Toc240990191"/>
       <w:r>
         <w:rPr>
           <w:rFonts w:ascii="Times New Roman" w:hAnsi="Times New Roman"/>
@@ -2790,7 +2863,7 @@
       <w:pPr>
         <w:pStyle w:val="1"/>
       </w:pPr>
-      <w:bookmarkStart w:id="8" w:name="_Toc240988202"/>
+      <w:bookmarkStart w:id="8" w:name="_Toc240990192"/>
       <w:r>
         <w:rPr>
           <w:rFonts w:ascii="Times New Roman" w:hAnsi="Times New Roman"/>
@@ -2803,7 +2876,7 @@
       <w:pPr>
         <w:pStyle w:val="21"/>
       </w:pPr>
-      <w:bookmarkStart w:id="9" w:name="_Toc240988203"/>
+      <w:bookmarkStart w:id="9" w:name="_Toc240990193"/>
       <w:r>
         <w:rPr>
           <w:rFonts w:ascii="Times New Roman" w:hAnsi="Times New Roman"/>
@@ -2882,7 +2955,7 @@
       <w:pPr>
         <w:pStyle w:val="21"/>
       </w:pPr>
-      <w:bookmarkStart w:id="10" w:name="_Toc240988204"/>
+      <w:bookmarkStart w:id="10" w:name="_Toc240990194"/>
       <w:r>
         <w:rPr>
           <w:rFonts w:ascii="Times New Roman" w:hAnsi="Times New Roman"/>
@@ -2926,7 +2999,7 @@
       <w:pPr>
         <w:pStyle w:val="21"/>
       </w:pPr>
-      <w:bookmarkStart w:id="11" w:name="_Toc240988205"/>
+      <w:bookmarkStart w:id="11" w:name="_Toc240990195"/>
       <w:r>
         <w:rPr>
           <w:rFonts w:ascii="Times New Roman" w:hAnsi="Times New Roman"/>
@@ -2958,7 +3031,7 @@
       <w:pPr>
         <w:pStyle w:val="21"/>
       </w:pPr>
-      <w:bookmarkStart w:id="12" w:name="_Toc240988206"/>
+      <w:bookmarkStart w:id="12" w:name="_Toc240990196"/>
       <w:r>
         <w:rPr>
           <w:rFonts w:ascii="Times New Roman" w:hAnsi="Times New Roman"/>
@@ -2997,7 +3070,7 @@
       <w:pPr>
         <w:pStyle w:val="21"/>
       </w:pPr>
-      <w:bookmarkStart w:id="13" w:name="_Toc240988207"/>
+      <w:bookmarkStart w:id="13" w:name="_Toc240990197"/>
       <w:r>
         <w:rPr>
           <w:rFonts w:ascii="Times New Roman" w:hAnsi="Times New Roman"/>
@@ -3034,7 +3107,7 @@
       <w:pPr>
         <w:pStyle w:val="1"/>
       </w:pPr>
-      <w:bookmarkStart w:id="14" w:name="_Toc240988208"/>
+      <w:bookmarkStart w:id="14" w:name="_Toc240990198"/>
       <w:r>
         <w:rPr>
           <w:rFonts w:ascii="Times New Roman" w:hAnsi="Times New Roman"/>
@@ -3047,7 +3120,7 @@
       <w:pPr>
         <w:pStyle w:val="21"/>
       </w:pPr>
-      <w:bookmarkStart w:id="15" w:name="_Toc240988209"/>
+      <w:bookmarkStart w:id="15" w:name="_Toc240990199"/>
       <w:r>
         <w:rPr>
           <w:rFonts w:ascii="Times New Roman" w:hAnsi="Times New Roman"/>
@@ -3119,7 +3192,7 @@
       <w:pPr>
         <w:pStyle w:val="21"/>
       </w:pPr>
-      <w:bookmarkStart w:id="16" w:name="_Toc240988210"/>
+      <w:bookmarkStart w:id="16" w:name="_Toc240990200"/>
       <w:r>
         <w:rPr>
           <w:rFonts w:ascii="Times New Roman" w:hAnsi="Times New Roman"/>
@@ -3217,7 +3290,7 @@
       <w:pPr>
         <w:pStyle w:val="21"/>
       </w:pPr>
-      <w:bookmarkStart w:id="17" w:name="_Toc240988211"/>
+      <w:bookmarkStart w:id="17" w:name="_Toc240990201"/>
       <w:r>
         <w:rPr>
           <w:rFonts w:ascii="Times New Roman" w:hAnsi="Times New Roman"/>
@@ -3500,7 +3573,7 @@
       <w:pPr>
         <w:pStyle w:val="21"/>
       </w:pPr>
-      <w:bookmarkStart w:id="18" w:name="_Toc240988212"/>
+      <w:bookmarkStart w:id="18" w:name="_Toc240990202"/>
       <w:r>
         <w:rPr>
           <w:rFonts w:ascii="Times New Roman" w:hAnsi="Times New Roman"/>
@@ -3523,43 +3596,90 @@
       </w:r>
       <w:r>
         <w:t>у нужного этапа (эпизод, разведка, оценка кандидатов, полный цикл). Отдельно настраивается шлюз расширения, который превращает сессии внешнего агента в записи того же графа, поэтому опыт не распадается на две базы.</w:t>
+      </w:r>
+    </w:p>
+    <w:p>
+      <w:pPr>
+        <w:pStyle w:val="21"/>
+      </w:pPr>
+      <w:bookmarkStart w:id="19" w:name="_Toc240990203"/>
+      <w:r>
+        <w:rPr>
+          <w:rFonts w:ascii="Times New Roman" w:hAnsi="Times New Roman"/>
+        </w:rPr>
+        <w:t>3.5. Как система встраивается в готовую о</w:t>
+      </w:r>
+      <w:r>
+        <w:rPr>
+          <w:rFonts w:ascii="Times New Roman" w:hAnsi="Times New Roman"/>
+        </w:rPr>
+        <w:t>бвязку</w:t>
+      </w:r>
+      <w:bookmarkEnd w:id="19"/>
+    </w:p>
+    <w:p>
+      <w:r>
+        <w:t xml:space="preserve">Помощник не пишется с нуля рядом с чужими решениями. Основой взят открытый проект CowAgent (лицензия MIT, язык Python): он даёт долгоживущий процесс, каналы связи, планировщик задач, консоль управления и механизм самообновления. Наша часть встроена </w:t>
+      </w:r>
+      <w:r>
+        <w:t>в него штатным способом, который этот же проект и предусматривает: через протокол MCP, тот же формат файла инструментов, что используют остальные программы на этой машине.</w:t>
+      </w:r>
+    </w:p>
+    <w:p>
+      <w:r>
+        <w:lastRenderedPageBreak/>
+        <w:t>В результате у помощника один узел подключает нашу память и вопрос человеку, а рядом</w:t>
+      </w:r>
+      <w:r>
+        <w:t xml:space="preserve"> работают уже готовые инструменты этой машины: личная память владельца, поиск по базе знаний, поиск в сети и браузер. В текущей сборке это пять серверов и 78 инструментов, загружаемых при старте; в логе видно, какие именно и сколько. Ничего из чужого кода </w:t>
+      </w:r>
+      <w:r>
+        <w:t>мы не переписывали: файл подключения копируется из рабочего конфига как есть, а наши данные лежат в графе, а не в файлах чужого проекта.</w:t>
+      </w:r>
+    </w:p>
+    <w:p>
+      <w:r>
+        <w:t>Такое разделение даёт то, чего не было бы при самостоятельной сборке всего заново: чужие проверенные механизмы (жизненн</w:t>
+      </w:r>
+      <w:r>
+        <w:t>ый цикл, память, каналы) достаются бесплатно, а наш предмет исследования, то есть структура памяти, измерение улучшений и решение человека, остаётся нашим и не тонет в чужом коде. Границы обозначены жёстко: наружу ничего не уходит без нажатия кнопки, а всё</w:t>
+      </w:r>
+      <w:r>
+        <w:t>, что помощник делает, записывается в граф с указанием роли, времени и происхождения записи.</w:t>
       </w:r>
     </w:p>
     <w:p>
       <w:pPr>
         <w:pStyle w:val="1"/>
       </w:pPr>
-      <w:bookmarkStart w:id="19" w:name="_Toc240988213"/>
+      <w:bookmarkStart w:id="20" w:name="_Toc240990204"/>
       <w:r>
         <w:rPr>
           <w:rFonts w:ascii="Times New Roman" w:hAnsi="Times New Roman"/>
         </w:rPr>
         <w:t>Глава 4. Метод измерения и результаты</w:t>
       </w:r>
-      <w:bookmarkEnd w:id="19"/>
+      <w:bookmarkEnd w:id="20"/>
     </w:p>
     <w:p>
       <w:pPr>
         <w:pStyle w:val="21"/>
       </w:pPr>
-      <w:bookmarkStart w:id="20" w:name="_Toc240988214"/>
+      <w:bookmarkStart w:id="21" w:name="_Toc240990205"/>
       <w:r>
         <w:rPr>
           <w:rFonts w:ascii="Times New Roman" w:hAnsi="Times New Roman"/>
         </w:rPr>
-        <w:t>4.1</w:t>
-      </w:r>
-      <w:r>
-        <w:rPr>
-          <w:rFonts w:ascii="Times New Roman" w:hAnsi="Times New Roman"/>
-        </w:rPr>
-        <w:t>. Как измеряется улучшение</w:t>
-      </w:r>
-      <w:bookmarkEnd w:id="20"/>
+        <w:t>4.1. Как измеряется улучшение</w:t>
+      </w:r>
+      <w:bookmarkEnd w:id="21"/>
     </w:p>
     <w:p>
       <w:r>
-        <w:t>Правила приёмки формулируются до поиска и не меняются внутри раунда; каждое их изменение вызывалось конкретным измерением, которое предыдущая версия пропустила. Правил было пять версий.</w:t>
+        <w:t>Правила приёмки формулируются до поиска и не меняются внутри раунда; каждое их изменение вызыва</w:t>
+      </w:r>
+      <w:r>
+        <w:t>лось конкретным измерением, которое предыдущая версия пропустила. Правил было пять версий.</w:t>
       </w:r>
     </w:p>
     <w:tbl>
@@ -3670,20 +3790,7 @@
               <w:rPr>
                 <w:sz w:val="24"/>
               </w:rPr>
-              <w:t>требо</w:t>
-            </w:r>
-            <w:r>
-              <w:rPr>
-                <w:sz w:val="24"/>
-              </w:rPr>
-              <w:t xml:space="preserve">вание покрытия: экономия признаётся, только </w:t>
-            </w:r>
-            <w:r>
-              <w:rPr>
-                <w:sz w:val="24"/>
-              </w:rPr>
-              <w:lastRenderedPageBreak/>
-              <w:t>если решения кандидата восстановимы</w:t>
+              <w:t>требование покрытия: экономия признаётся, только если решения кандидата восстановимы</w:t>
             </w:r>
           </w:p>
         </w:tc>
@@ -3701,15 +3808,13 @@
               <w:rPr>
                 <w:sz w:val="24"/>
               </w:rPr>
-              <w:lastRenderedPageBreak/>
-              <w:t xml:space="preserve">раунды 2 и 3 развернули улучшения при 0 </w:t>
-            </w:r>
-            <w:r>
-              <w:rPr>
-                <w:sz w:val="24"/>
-              </w:rPr>
-              <w:lastRenderedPageBreak/>
-              <w:t>восстановленных решениях из 26, и оба оказались хуже</w:t>
+              <w:t>раунды 2 и 3 развернули улучшения при 0 во</w:t>
+            </w:r>
+            <w:r>
+              <w:rPr>
+                <w:sz w:val="24"/>
+              </w:rPr>
+              <w:t>сстановленных решениях из 26, и оба оказались хуже</w:t>
             </w:r>
           </w:p>
         </w:tc>
@@ -3729,7 +3834,6 @@
               <w:rPr>
                 <w:sz w:val="24"/>
               </w:rPr>
-              <w:lastRenderedPageBreak/>
               <w:t>v3</w:t>
             </w:r>
           </w:p>
@@ -3766,13 +3870,7 @@
               <w:rPr>
                 <w:sz w:val="24"/>
               </w:rPr>
-              <w:t>три кан</w:t>
-            </w:r>
-            <w:r>
-              <w:rPr>
-                <w:sz w:val="24"/>
-              </w:rPr>
-              <w:t>дидата с прогнозом от +22,5 до +26,6 процента и без единого восстановленного решения</w:t>
+              <w:t>три кандидата с прогнозом от +22,5 до +26,6 процента и без единого восстановленного решения</w:t>
             </w:r>
           </w:p>
         </w:tc>
@@ -3810,7 +3908,13 @@
               <w:rPr>
                 <w:sz w:val="24"/>
               </w:rPr>
-              <w:t>политика, меняющая то, что агент видит, обязана измеряться в рабочем режиме независимо от покрытия</w:t>
+              <w:t xml:space="preserve">политика, меняющая то, что агент </w:t>
+            </w:r>
+            <w:r>
+              <w:rPr>
+                <w:sz w:val="24"/>
+              </w:rPr>
+              <w:t>видит, обязана измеряться в рабочем режиме независимо от покрытия</w:t>
             </w:r>
           </w:p>
         </w:tc>
@@ -3828,13 +3932,7 @@
               <w:rPr>
                 <w:sz w:val="24"/>
               </w:rPr>
-              <w:t>контрольная политика window3: прогноз +7,6 процента при покрытии 72,</w:t>
-            </w:r>
-            <w:r>
-              <w:rPr>
-                <w:sz w:val="24"/>
-              </w:rPr>
-              <w:t>7 процента, измерение дало +12,4 процента хуже, а на отложенных задачах +81,8 процента хуже</w:t>
+              <w:t>контрольная политика window3: прогноз +7,6 процента при покрытии 72,7 процента, измерение дало +12,4 процента хуже, а на отложенных задачах +81,8 процента хуже</w:t>
             </w:r>
           </w:p>
         </w:tc>
@@ -3872,7 +3970,20 @@
               <w:rPr>
                 <w:sz w:val="24"/>
               </w:rPr>
-              <w:t>три прогона на задачу вместо одного, прежде чем называть число</w:t>
+              <w:t xml:space="preserve">три прогона на задачу </w:t>
+            </w:r>
+            <w:r>
+              <w:rPr>
+                <w:sz w:val="24"/>
+              </w:rPr>
+              <w:t xml:space="preserve">вместо </w:t>
+            </w:r>
+            <w:r>
+              <w:rPr>
+                <w:sz w:val="24"/>
+              </w:rPr>
+              <w:lastRenderedPageBreak/>
+              <w:t>одного, прежде чем называть число</w:t>
             </w:r>
           </w:p>
         </w:tc>
@@ -3890,7 +4001,15 @@
               <w:rPr>
                 <w:sz w:val="24"/>
               </w:rPr>
-              <w:t>раунд 9: одно измерение дало минус 3,4 процента, три повтора дали плюс 4,0 процента</w:t>
+              <w:lastRenderedPageBreak/>
+              <w:t xml:space="preserve">раунд 9: одно измерение дало </w:t>
+            </w:r>
+            <w:r>
+              <w:rPr>
+                <w:sz w:val="24"/>
+              </w:rPr>
+              <w:lastRenderedPageBreak/>
+              <w:t>минус 3,4 процента, три повтора дали плюс 4,0 процента</w:t>
             </w:r>
           </w:p>
         </w:tc>
@@ -3899,34 +4018,34 @@
     <w:p/>
     <w:p>
       <w:r>
-        <w:t>Измерение в</w:t>
-      </w:r>
-      <w:r>
-        <w:t xml:space="preserve"> рабочем режиме дорого, поэтому перед каждым раундом судья решает большинство кандидатов бесплатно, а платят только за тех, кого судья не смог оценить или кто меняет поведение агента. Шум самого провайдера проверен контрольной политикой: одна и та же обвяз</w:t>
-      </w:r>
-      <w:r>
-        <w:t>ка при повторах даёт разброс около плюс-минус 20 процентов, поэтому одиночный прогон не доказывает ничего.</w:t>
+        <w:t>Измерение в рабочем режиме дорого, поэтому перед каждым раундом судья решает большинство кандидатов бесплатно, а платят только за</w:t>
+      </w:r>
+      <w:r>
+        <w:t xml:space="preserve"> тех, кого судья не смог оценить или кто меняет поведение агента. Шум самого провайдера проверен контрольной политикой: одна и та же обвязка при повторах даёт разброс около плюс-минус 20 процентов, поэтому одиночный прогон не доказывает ничего.</w:t>
       </w:r>
     </w:p>
     <w:p>
       <w:pPr>
         <w:pStyle w:val="21"/>
       </w:pPr>
-      <w:bookmarkStart w:id="21" w:name="_Toc240988215"/>
+      <w:bookmarkStart w:id="22" w:name="_Toc240990206"/>
       <w:r>
         <w:rPr>
           <w:rFonts w:ascii="Times New Roman" w:hAnsi="Times New Roman"/>
         </w:rPr>
-        <w:t>4.2. Сон в детерминированных мирах</w:t>
-      </w:r>
-      <w:bookmarkEnd w:id="21"/>
+        <w:t xml:space="preserve">4.2. Сон в </w:t>
+      </w:r>
+      <w:r>
+        <w:rPr>
+          <w:rFonts w:ascii="Times New Roman" w:hAnsi="Times New Roman"/>
+        </w:rPr>
+        <w:t>детерминированных мирах</w:t>
+      </w:r>
+      <w:bookmarkEnd w:id="22"/>
     </w:p>
     <w:p>
       <w:r>
-        <w:t xml:space="preserve">Восемь независимых прогонов (пять зёрен островного мира, три зерна мастерской, по три раунда), измеренных в самом </w:t>
-      </w:r>
-      <w:r>
-        <w:t>мире, а не по оценке судьи:</w:t>
+        <w:t>Восемь независимых прогонов (пять зёрен островного мира, три зерна мастерской, по три раунда), измеренных в самом мире, а не по оценке судьи:</w:t>
       </w:r>
     </w:p>
     <w:tbl>
@@ -4298,35 +4417,31 @@
         <w:t>oneiro-1</w:t>
       </w:r>
       <w:r>
-        <w:t>), и он принимается как честная нижняя граница метода на этом мире. Оценка судьи при этом завышает результат на 22 до 30 процентов относительно измеренного: судья</w:t>
-      </w:r>
-      <w:r>
-        <w:t xml:space="preserve"> хорошо упорядочивает </w:t>
-      </w:r>
-      <w:r>
-        <w:lastRenderedPageBreak/>
-        <w:t>кандидатов и не годится как предсказание. Это ограничение важнее самого успеха, и оно перенесено в правила приёмки.</w:t>
+        <w:t>), и он принимается как честная нижняя г</w:t>
+      </w:r>
+      <w:r>
+        <w:t>раница метода на этом мире. Оценка судьи при этом завышает результат на 22 до 30 процентов относительно измеренного: судья хорошо упорядочивает кандидатов и не годится как предсказание. Это ограничение важнее самого успеха, и оно перенесено в правила приём</w:t>
+      </w:r>
+      <w:r>
+        <w:t>ки.</w:t>
       </w:r>
     </w:p>
     <w:p>
       <w:pPr>
         <w:pStyle w:val="21"/>
       </w:pPr>
-      <w:bookmarkStart w:id="22" w:name="_Toc240988216"/>
+      <w:bookmarkStart w:id="23" w:name="_Toc240990207"/>
       <w:r>
         <w:rPr>
           <w:rFonts w:ascii="Times New Roman" w:hAnsi="Times New Roman"/>
         </w:rPr>
         <w:t>4.3. Что сохраняет граф знаний</w:t>
       </w:r>
-      <w:bookmarkEnd w:id="22"/>
+      <w:bookmarkEnd w:id="23"/>
     </w:p>
     <w:p>
       <w:r>
-        <w:t xml:space="preserve">Прямой замер памяти на одном эпизоде из 25 записанных попыток, с отключением отдельных </w:t>
-      </w:r>
-      <w:r>
-        <w:t>видов связей:</w:t>
+        <w:t>Прямой замер памяти на одном эпизоде из 25 записанных попыток, с отключением отдельных видов связей:</w:t>
       </w:r>
     </w:p>
     <w:tbl>
@@ -4513,7 +4628,14 @@
               <w:rPr>
                 <w:sz w:val="24"/>
               </w:rPr>
-              <w:t>плоское хранилище (неупорядоченный список)</w:t>
+              <w:lastRenderedPageBreak/>
+              <w:t xml:space="preserve">плоское хранилище </w:t>
+            </w:r>
+            <w:r>
+              <w:rPr>
+                <w:sz w:val="24"/>
+              </w:rPr>
+              <w:t>(неупорядоченный список)</w:t>
             </w:r>
           </w:p>
         </w:tc>
@@ -4735,13 +4857,7 @@
               <w:rPr>
                 <w:sz w:val="24"/>
               </w:rPr>
-              <w:t xml:space="preserve">граф без связей </w:t>
-            </w:r>
-            <w:r>
-              <w:rPr>
-                <w:sz w:val="24"/>
-              </w:rPr>
-              <w:t>происхождения</w:t>
+              <w:t>граф без связей происхождения</w:t>
             </w:r>
           </w:p>
         </w:tc>
@@ -4905,43 +5021,45 @@
         <w:t>происхождение</w:t>
       </w:r>
       <w:r>
-        <w:t xml:space="preserve"> (без этих связей признак источник-вид не переживает выборку вовсе). Это сильнейшее имеющееся у нас свидетельство того, что структура несёт нагрузку, и одновременно самое слаб</w:t>
-      </w:r>
-      <w:r>
-        <w:t>ое место: замер сделан на одном эпизоде, и он измеряет качество выборки, а не влияние на результат работы.</w:t>
+        <w:t xml:space="preserve"> (без этих связей признак источник-вид не переживает выборку вовсе). Это сильнейшее и</w:t>
+      </w:r>
+      <w:r>
+        <w:t>меющееся у нас свидетельство того, что структура несёт нагрузку, и одновременно самое слабое место: замер сделан на одном эпизоде, и он измеряет качество выборки, а не влияние на результат работы.</w:t>
       </w:r>
     </w:p>
     <w:p>
       <w:r>
-        <w:t>Проверка на публичном наборе LongMemEval (детали в приложении А) равна по итогу: плоский журнал 72,7 процента, граф 72,1 процента, без памяти 4,1 про</w:t>
-      </w:r>
-      <w:r>
-        <w:t>цента. Разница между двумя видами памяти внутри шума, а разделение по типам вопросов показывает, где именно структура помогает: на вопросах о времени граф даёт 40,0 процента против 16,7 у плоского журнала, а на многосессионных вопросах проигрывает (58,3 пр</w:t>
-      </w:r>
-      <w:r>
-        <w:t>отив 66,7). Полный контекст без всякой выборки даёт до 94 процентов, то есть сама задача для нашей модели разрешима, и упрощать её мы не стали.</w:t>
+        <w:t>Проверка на публичном наборе LongMemEval (детали в приложен</w:t>
+      </w:r>
+      <w:r>
+        <w:t>ии А) равна по итогу: плоский журнал 72,7 процента, граф 72,1 процента, без памяти 4,1 процента. Разница между двумя видами памяти внутри шума, а разделение по типам вопросов показывает, где именно структура помогает: на вопросах о времени граф даёт 40,0 п</w:t>
+      </w:r>
+      <w:r>
+        <w:t>роцента против 16,7 у плоского журнала, а на многосессионных вопросах проигрывает (58,3 против 66,7). Полный контекст без всякой выборки даёт до 94 процентов, то есть сама задача для нашей модели разрешима, и упрощать её мы не стали.</w:t>
       </w:r>
     </w:p>
     <w:p>
       <w:pPr>
         <w:pStyle w:val="21"/>
       </w:pPr>
-      <w:bookmarkStart w:id="23" w:name="_Toc240988217"/>
+      <w:bookmarkStart w:id="24" w:name="_Toc240990208"/>
       <w:r>
         <w:rPr>
           <w:rFonts w:ascii="Times New Roman" w:hAnsi="Times New Roman"/>
         </w:rPr>
-        <w:lastRenderedPageBreak/>
-        <w:t>4.4. Поиск по обвязке: одиннадцать раундов</w:t>
-      </w:r>
-      <w:bookmarkEnd w:id="23"/>
+        <w:t>4.4. Поиск по обвязке:</w:t>
+      </w:r>
+      <w:r>
+        <w:rPr>
+          <w:rFonts w:ascii="Times New Roman" w:hAnsi="Times New Roman"/>
+        </w:rPr>
+        <w:t xml:space="preserve"> одиннадцать раундов</w:t>
+      </w:r>
+      <w:bookmarkEnd w:id="24"/>
     </w:p>
     <w:p>
       <w:r>
-        <w:t>Одиннадцать раундов, 29 предложенных кандидатов, четыре развёртывания</w:t>
-      </w:r>
-      <w:r>
-        <w:t>. Результат первых десяти: ни одного, которое пережило бы честное измерение.</w:t>
+        <w:t>Одиннадцать раундов, 29 предложенных кандидатов, четыре развёртывания. Результат первых десяти: ни одного, которое пережило бы честное измерение.</w:t>
       </w:r>
     </w:p>
     <w:tbl>
@@ -5133,7 +5251,14 @@
                 <w:b/>
                 <w:sz w:val="24"/>
               </w:rPr>
-              <w:t>+27,0 процента</w:t>
+              <w:t xml:space="preserve">+27,0 </w:t>
+            </w:r>
+            <w:r>
+              <w:rPr>
+                <w:b/>
+                <w:sz w:val="24"/>
+              </w:rPr>
+              <w:t>процента</w:t>
             </w:r>
             <w:r>
               <w:rPr>
@@ -5195,7 +5320,14 @@
               <w:rPr>
                 <w:sz w:val="24"/>
               </w:rPr>
-              <w:t xml:space="preserve">развёрнуто; в рабочем режиме </w:t>
+              <w:t xml:space="preserve">развёрнуто; в рабочем </w:t>
+            </w:r>
+            <w:r>
+              <w:rPr>
+                <w:sz w:val="24"/>
+              </w:rPr>
+              <w:lastRenderedPageBreak/>
+              <w:t xml:space="preserve">режиме </w:t>
             </w:r>
             <w:r>
               <w:rPr>
@@ -5228,6 +5360,7 @@
               <w:rPr>
                 <w:sz w:val="24"/>
               </w:rPr>
+              <w:lastRenderedPageBreak/>
               <w:t>4</w:t>
             </w:r>
           </w:p>
@@ -5376,7 +5509,13 @@
               <w:rPr>
                 <w:sz w:val="24"/>
               </w:rPr>
-              <w:t>измерено и отклонено: прогноз +32,0 процента, измерение +1,5 процента</w:t>
+              <w:t xml:space="preserve">измерено и отклонено: прогноз </w:t>
+            </w:r>
+            <w:r>
+              <w:rPr>
+                <w:sz w:val="24"/>
+              </w:rPr>
+              <w:t>+32,0 процента, измерение +1,5 процента</w:t>
             </w:r>
           </w:p>
         </w:tc>
@@ -5432,13 +5571,7 @@
               <w:rPr>
                 <w:sz w:val="24"/>
               </w:rPr>
-              <w:t xml:space="preserve">развёрнуто по одному </w:t>
-            </w:r>
-            <w:r>
-              <w:rPr>
-                <w:sz w:val="24"/>
-              </w:rPr>
-              <w:t>прогону на задачу (минус 3,4 процента); при трёх прогонах плюс 4,0 процента, переноса нет</w:t>
+              <w:t>развёрнуто по одному прогону на задачу (минус 3,4 процента); при трёх прогонах плюс 4,0 процента, переноса нет</w:t>
             </w:r>
           </w:p>
         </w:tc>
@@ -5570,7 +5703,14 @@
                 <w:b/>
                 <w:sz w:val="24"/>
               </w:rPr>
-              <w:t>минус 28,5 процента</w:t>
+              <w:t xml:space="preserve">минус </w:t>
+            </w:r>
+            <w:r>
+              <w:rPr>
+                <w:b/>
+                <w:sz w:val="24"/>
+              </w:rPr>
+              <w:t>28,5 процента</w:t>
             </w:r>
             <w:r>
               <w:rPr>
@@ -5585,59 +5725,59 @@
     <w:p/>
     <w:p>
       <w:r>
-        <w:t xml:space="preserve">Раунд 11 это единственная защищаемая </w:t>
-      </w:r>
-      <w:r>
-        <w:t>экономия за всю историю. Политика в нём состоит из двух полей: отсутствие начального вывода тестов в первом запросе и более длинные наблюдения инструментов (1500 символов вместо 1000). По отдельности ни одно поле не работает (первое поле в одиночку дало пл</w:t>
-      </w:r>
-      <w:r>
-        <w:t>юс 27 процентов в раунде 2), работает только их сочетание, и установить это можно было только измерением в рабочем режиме.</w:t>
+        <w:t>Раунд 11 это единственная защищаемая экономия за всю историю. Политика в нём состоит из двух полей: отсутствие начального вывода тестов в первом запросе и более длинные наблюдения инструментов (1500 символов вместо 1000). По от</w:t>
+      </w:r>
+      <w:r>
+        <w:t>дельности ни одно поле не работает (первое поле в одиночку дало плюс 27 процентов в раунде 2), работает только их сочетание, и установить это можно было только измерением в рабочем режиме.</w:t>
       </w:r>
     </w:p>
     <w:p>
       <w:r>
-        <w:t>За одиннадцать раундов потрачено 26 прогонов в рабочем режиме; если бы каждого из 29 кандидатов измеряли один раз на каждой поисковой</w:t>
-      </w:r>
-      <w:r>
-        <w:t xml:space="preserve"> задаче, потребовалось бы 116 прогонов. Экономия 90 прогонов (в 4,5 раза) на пути к этим решениям и есть экономический аргумент метода.</w:t>
+        <w:t>За одиннадцать раундов потрачено 26 прогонов в рабочем режиме; если</w:t>
+      </w:r>
+      <w:r>
+        <w:t xml:space="preserve"> бы каждого из 29 кандидатов измеряли один раз на каждой поисковой задаче, потребовалось бы 116 прогонов. Экономия 90 прогонов (в 4,5 раза) на пути к этим решениям и есть экономический аргумент метода.</w:t>
       </w:r>
     </w:p>
     <w:p>
       <w:r>
-        <w:lastRenderedPageBreak/>
-        <w:t>Из девятнадцати отклонённых кандидатов большинство отклонено бесплатно, по записям. Судья ошибался в обе стороны: на сем</w:t>
-      </w:r>
-      <w:r>
-        <w:t>и написанных вручную обвязках его оценка расходилась с измерением от минус 43 до плюс 26 процентов.</w:t>
+        <w:t>Из девятнадцати отклонённых кандидатов большинство отк</w:t>
+      </w:r>
+      <w:r>
+        <w:t>лонено бесплатно, по записям. Судья ошибался в обе стороны: на семи написанных вручную обвязках его оценка расходилась с измерением от минус 43 до плюс 26 процентов.</w:t>
       </w:r>
     </w:p>
     <w:p>
       <w:pPr>
         <w:pStyle w:val="21"/>
       </w:pPr>
-      <w:bookmarkStart w:id="24" w:name="_Toc240988218"/>
+      <w:bookmarkStart w:id="25" w:name="_Toc240990209"/>
       <w:r>
         <w:rPr>
           <w:rFonts w:ascii="Times New Roman" w:hAnsi="Times New Roman"/>
         </w:rPr>
         <w:t>4.5. Живой цикл: что подтверждено в графе</w:t>
       </w:r>
-      <w:bookmarkEnd w:id="24"/>
+      <w:bookmarkEnd w:id="25"/>
     </w:p>
     <w:p>
       <w:r>
-        <w:t>Живая запись в графе знаний на момент подготовки работы содержит 69 записей организации: 4 запуска цикла, 6 циклов</w:t>
-      </w:r>
-      <w:r>
-        <w:t>, 6 наборов предложений и 6 решений менеджера, 6 созданных рабочих копий, 5 записей о пакетах изменений, 1 запись о возобновлении после перезапуска, 3 записи о запуске шлюза расширения и по одной записи о срыве цикла и о срыве heartbeat.</w:t>
+        <w:t>Живая запись в графе знаний на момент подготовки</w:t>
+      </w:r>
+      <w:r>
+        <w:t xml:space="preserve"> работы содержит 69 записей организации: 4 запуска цикла, 6 циклов, 6 наборов предложений и 6 </w:t>
+      </w:r>
+      <w:r>
+        <w:lastRenderedPageBreak/>
+        <w:t xml:space="preserve">решений менеджера, 6 созданных рабочих копий, 5 записей о пакетах изменений, 1 запись о возобновлении после перезапуска, 3 записи о запуске шлюза расширения и по </w:t>
+      </w:r>
+      <w:r>
+        <w:t>одной записи о срыве цикла и о срыве heartbeat.</w:t>
       </w:r>
     </w:p>
     <w:p>
       <w:r>
-        <w:t xml:space="preserve">Из пяти записей о </w:t>
-      </w:r>
-      <w:r>
-        <w:t xml:space="preserve">пакетах четыре принадлежат живым прогонам, а одна оставлена проверкой расширения шлюза (имя ветки содержит слово </w:t>
+        <w:t xml:space="preserve">Из пяти записей о пакетах четыре принадлежат живым прогонам, а одна оставлена проверкой расширения шлюза (имя ветки содержит слово </w:t>
       </w:r>
       <w:r>
         <w:rPr>
@@ -5647,57 +5787,60 @@
         <w:t>test</w:t>
       </w:r>
       <w:r>
-        <w:t xml:space="preserve">, изменённых файлов ноль). Записи не удаляются: журнал показывает и рабочие циклы, и испытания, потому что этим он и отличается от отчёта, </w:t>
-      </w:r>
-      <w:r>
-        <w:t>сочинённого в конце.</w:t>
+        <w:t>, изменённых файлов ноль). Записи не удаляются: журнал показывает и рабоч</w:t>
+      </w:r>
+      <w:r>
+        <w:t>ие циклы, и испытания, потому что этим он и отличается от отчёта, сочинённого в конце.</w:t>
       </w:r>
     </w:p>
     <w:p>
       <w:r>
-        <w:t>Срывы тоже названы: цикл сорвался один раз, когда провайдер отдал ошибку соединения, страховая модель ответила не по схеме, менеджер записал ошибку схемы, и цикл был пропущен без заморозки системы.</w:t>
+        <w:t xml:space="preserve">Срывы тоже названы: цикл сорвался один раз, когда провайдер отдал ошибку соединения, страховая модель ответила не по схеме, менеджер записал ошибку схемы, и цикл был </w:t>
+      </w:r>
+      <w:r>
+        <w:t>пропущен без заморозки системы.</w:t>
       </w:r>
     </w:p>
     <w:p>
       <w:pPr>
         <w:pStyle w:val="1"/>
       </w:pPr>
-      <w:bookmarkStart w:id="25" w:name="_Toc240988219"/>
+      <w:bookmarkStart w:id="26" w:name="_Toc240990210"/>
       <w:r>
         <w:rPr>
           <w:rFonts w:ascii="Times New Roman" w:hAnsi="Times New Roman"/>
         </w:rPr>
         <w:t>Заключение</w:t>
       </w:r>
-      <w:bookmarkEnd w:id="25"/>
+      <w:bookmarkEnd w:id="26"/>
     </w:p>
     <w:p>
       <w:r>
-        <w:t>Поставленные задачи решены</w:t>
-      </w:r>
-      <w:r>
-        <w:t xml:space="preserve"> в следующем объёме.</w:t>
+        <w:t>Поставленные задачи решены в следующем объёме.</w:t>
       </w:r>
     </w:p>
     <w:p>
       <w:r>
-        <w:t>Онтология опыта описана и работает: полная траектория агента, включая состояния, допустимые действия и числовые исходы, записывается в граф знаний, и связи времени и происхождения в нём проверены отключением (задача 1). Механизм самоул</w:t>
-      </w:r>
-      <w:r>
-        <w:t>учшения реализован и измерен на двух структурно разных мирах: восемь из восьми зёрен улучшились после одного сна, от +14,7 до +114,9 (задача 2). Цикл перенесён на реального кодирующего агента; судья по записям восстанавливает запросы посимвольно, а правило</w:t>
-      </w:r>
-      <w:r>
-        <w:t xml:space="preserve"> «политику, меняющую поведение, измерять в рабочем режиме» появилось именно на этом переносе (задача 3). Правила приёмки заморожены и пересматривались пять </w:t>
+        <w:t xml:space="preserve">Онтология опыта описана и работает: полная траектория агента, включая состояния, допустимые действия и числовые исходы, записывается в граф знаний, и связи времени и </w:t>
+      </w:r>
+      <w:r>
+        <w:t>происхождения в нём проверены отключением (задача 1). Механизм самоулучшения реализован и измерен на двух структурно разных мирах: восемь из восьми зёрен улучшились после одного сна, от +14,7 до +114,9 (задача 2). Цикл перенесён на реального кодирующего аг</w:t>
+      </w:r>
+      <w:r>
+        <w:t>ента; судья по записям восстанавливает запросы посимвольно, а правило «политику, меняющую поведение, измерять в рабочем режиме» появилось именно на этом переносе (задача 3). Правила приёмки заморожены и пересматривались пять раз, каждое изменение вынуждено</w:t>
+      </w:r>
+      <w:r>
+        <w:t xml:space="preserve"> измерением; измерение с тремя повторами отделило настоящую экономию от шума провайдера в плюс-минус 20 процентов (задача 4). Память сравнена на публичном наборе с плоским журналом и без памяти; подстройка под известный протокол судьи сохранена (задача 5).</w:t>
+      </w:r>
+      <w:r>
+        <w:t xml:space="preserve"> Автономный цикл из трёх ролей работает, переживает перезапуск процесса и оставляет незалитые пакеты изменений с доказательствами (задача </w:t>
       </w:r>
       <w:r>
         <w:lastRenderedPageBreak/>
-        <w:t xml:space="preserve">раз, каждое изменение вынуждено измерением; измерение с тремя повторами отделило настоящую экономию </w:t>
-      </w:r>
-      <w:r>
-        <w:t>от шума провайдера в плюс-минус 20 процентов (задача 4). Память сравнена на публичном наборе с плоским журналом и без памяти; подстройка под известный протокол судьи сохранена (задача 5). Автономный цикл из трёх ролей работает, переживает перезапуск процес</w:t>
-      </w:r>
-      <w:r>
-        <w:t>са и оставляет незалитые пакеты изменений с доказательствами (задача 6). Практическое применение описано двумя сценариями, для долгого проекта и для повседневной работы, вместе с требованиями к запуску (задача 7).</w:t>
+        <w:t>6). Практическое применение описано двумя сценариями, для долгого проекта и для повседневной работы, вместе с требован</w:t>
+      </w:r>
+      <w:r>
+        <w:t>иями к запуску (задача 7).</w:t>
       </w:r>
     </w:p>
     <w:p>
@@ -5708,60 +5851,57 @@
         <w:t>Практический итог.</w:t>
       </w:r>
       <w:r>
-        <w:t xml:space="preserve"> Система работает как по</w:t>
-      </w:r>
-      <w:r>
-        <w:t>мощник, а не как лабораторная демонстрация. Она ведёт цикл из трёх ролей, помнит свою работу записями в графе, продолжает её после перезапуска процесса и оставляет человеку готовые к проверке пакеты изменений. Опыт, записанный с онтологией, позволяет отбир</w:t>
-      </w:r>
-      <w:r>
-        <w:t>ать улучшения почти бесплатно: из 29 предложенных кандидатов 19 отклонены по записям без единого запуска, а один развёрнутый вариант дал переносимую экономию запросов на реальном агенте. Память сравнена с плоским журналом и с полным отсутствием памяти на п</w:t>
-      </w:r>
-      <w:r>
-        <w:t>убличном наборе: без памяти 4,1 процента, с памятью около 72 процентов, а структура графа выигрывает там, где она и должна выигрывать: на вопросах о времени (40,0 против 16,7 процента) и на сохранении порядка и происхождения записей.</w:t>
+        <w:t xml:space="preserve"> Система работает как помощник, а не как лабораторная демонстрация. Она ведёт цикл из трёх ролей, помнит свою работу записями в графе, продолжает её после перезапуска процесса и оставляет человеку готовые к пров</w:t>
+      </w:r>
+      <w:r>
+        <w:t xml:space="preserve">ерке пакеты изменений. Опыт, записанный с онтологией, позволяет отбирать улучшения почти бесплатно: из 29 предложенных кандидатов 19 отклонены по записям без единого запуска, а один развёрнутый вариант дал переносимую экономию запросов на реальном агенте. </w:t>
+      </w:r>
+      <w:r>
+        <w:t xml:space="preserve">Память сравнена с плоским журналом и с полным отсутствием памяти на публичном наборе: без памяти 4,1 процента, с памятью около 72 процентов, а структура графа выигрывает там, где она и должна выигрывать: на вопросах о времени (40,0 против 16,7 процента) и </w:t>
+      </w:r>
+      <w:r>
+        <w:t>на сохранении порядка и происхождения записей.</w:t>
       </w:r>
     </w:p>
     <w:p>
       <w:r>
-        <w:t>Отсюда ближайшие напра</w:t>
-      </w:r>
-      <w:r>
-        <w:t>вления работы. Первое: расширить предмет работы за пределы кода (почта, таблицы, документы по образцу), потому что помощник в повседневной работе школы и офиса это тот же двигатель с другим предметом; канал, которым решение уходит человеку и возвращается е</w:t>
-      </w:r>
-      <w:r>
-        <w:t>го нажатием, для этого уже есть. Третье: перенести чтение записей внутрь графа на всех площадках, включая поиск по обвязке, чтобы память агента была одинаковой в мире и в живой работе. Четвёртое: расширить набор задач с шести до двенадцати и более и повтор</w:t>
-      </w:r>
-      <w:r>
-        <w:t>ить замер памяти, чтобы разница между видами памяти перестала быть в пределах шума.</w:t>
+        <w:t>Отсюда ближайшие направления работы. Первое: расширить предмет работы за пределы кода (почта, таблицы, документы по образцу), потому что помощник в повседневной работе школы и офиса это тот же двигатель с друг</w:t>
+      </w:r>
+      <w:r>
+        <w:t>им предметом; канал, которым решение уходит человеку и возвращается его нажатием, для этого уже есть. Третье: перенести чтение записей внутрь графа на всех площадках, включая поиск по обвязке, чтобы память агента была одинаковой в мире и в живой работе. Че</w:t>
+      </w:r>
+      <w:r>
+        <w:t>твёртое: расширить набор задач с шести до двенадцати и более и повторить замер памяти, чтобы разница между видами памяти перестала быть в пределах шума.</w:t>
       </w:r>
     </w:p>
     <w:p>
       <w:pPr>
         <w:pStyle w:val="1"/>
       </w:pPr>
-      <w:bookmarkStart w:id="26" w:name="_Toc240988220"/>
+      <w:bookmarkStart w:id="27" w:name="_Toc240990211"/>
       <w:r>
         <w:rPr>
           <w:rFonts w:ascii="Times New Roman" w:hAnsi="Times New Roman"/>
         </w:rPr>
-        <w:lastRenderedPageBreak/>
         <w:t>Список использованных источников</w:t>
       </w:r>
-      <w:bookmarkEnd w:id="26"/>
+      <w:bookmarkEnd w:id="27"/>
     </w:p>
     <w:p>
       <w:r>
-        <w:t xml:space="preserve">1. Голенков В.В., Гулякина Н.А. Открытая семантическая технология проектирования интеллектуальных систем (OSTIS) // Сборник научных трудов </w:t>
-      </w:r>
-      <w:r>
-        <w:t>OSTIS. Минск, 2023. URL: https://proc.ostis.net/proc/Proceedings%20OSTIS-2023.pdf (дата обращения: 22.09.2026).</w:t>
+        <w:t>1. Голенков В.В., Гулякина Н.А. Открытая семантическая технология прое</w:t>
+      </w:r>
+      <w:r>
+        <w:t>ктирования интеллектуальных систем (OSTIS) // Сборник научных трудов OSTIS. Минск, 2023. URL: https://proc.ostis.net/proc/Proceedings%20OSTIS-2023.pdf (дата обращения: 22.09.2026).</w:t>
       </w:r>
     </w:p>
     <w:p>
       <w:r>
-        <w:t>2. Голенков В.В. и др. Интеллектуальные компьютерные системы нового поколения // Доклады БГУИР. 2024. URL: https://doklady.bsuir.by/jour/article</w:t>
-      </w:r>
-      <w:r>
-        <w:t>/view/3906 (дата обращения: 22.09.2026).</w:t>
+        <w:lastRenderedPageBreak/>
+        <w:t>2. Голенков В.В. и др. Интеллектуальные компьютерные системы нового поколен</w:t>
+      </w:r>
+      <w:r>
+        <w:t>ия // Доклады БГУИР. 2024. URL: https://doklady.bsuir.by/jour/article/view/3906 (дата обращения: 22.09.2026).</w:t>
       </w:r>
     </w:p>
     <w:p>
@@ -5771,10 +5911,10 @@
     </w:p>
     <w:p>
       <w:r>
-        <w:t>4. Dream-RSI: накопленная история как симулятор для поиска стратегий. arX</w:t>
-      </w:r>
-      <w:r>
-        <w:t>iv:2609.14858 (текст статьи передан руководителю работы).</w:t>
+        <w:t>4. D</w:t>
+      </w:r>
+      <w:r>
+        <w:t>ream-RSI: накопленная история как симулятор для поиска стратегий. arXiv:2609.14858 (текст статьи передан руководителю работы).</w:t>
       </w:r>
     </w:p>
     <w:p>
@@ -5784,28 +5924,31 @@
     </w:p>
     <w:p>
       <w:r>
-        <w:t>6. SoL-Pi: рекурсивное масштабирование автоматического исследования на</w:t>
-      </w:r>
-      <w:r>
-        <w:t xml:space="preserve"> уровне обвязки. arXiv:2609.20519 (текст статьи передан руководителю работы).</w:t>
+        <w:t>6</w:t>
+      </w:r>
+      <w:r>
+        <w:t>. SoL-Pi: рекурсивное масштабирование автоматического исследования на уровне обвязки. arXiv:2609.20519 (текст статьи передан руководителю работы).</w:t>
       </w:r>
     </w:p>
     <w:p>
       <w:r>
-        <w:t>7. GAVEL: явная символьная модель мира для проверки и починки планов. arXiv:2609.19315 (текст статьи передан руководителю работы).</w:t>
+        <w:t xml:space="preserve">7. GAVEL: явная символьная модель мира для проверки и починки планов. arXiv:2609.19315 (текст статьи передан </w:t>
+      </w:r>
+      <w:r>
+        <w:t>руководителю работы).</w:t>
       </w:r>
     </w:p>
     <w:p>
       <w:r>
-        <w:t xml:space="preserve">8. Wu D. et al. LongMemEval: Benchmarking Chat </w:t>
-      </w:r>
-      <w:r>
-        <w:t>Assistants on Long-Term Interactive Memory // arXiv:2410.10813, 2024. URL: https://arxiv.org/abs/2410.10813 (дата обращения: 22.09.2026).</w:t>
+        <w:t>8. Wu D. et al. LongMemEval: Benchmarking Chat Assistants on Long-Term Interactive Memory // arXiv:2410.10813, 2024. URL: https://arxiv.org/abs/2410.10813 (дата обращения: 22.09.2026).</w:t>
       </w:r>
     </w:p>
     <w:p>
       <w:r>
-        <w:t>9. Материалы проекта Oneiro-OSTIS: описание цикла по обвязке (</w:t>
+        <w:t>9. Материалы проекта Oneiro-OSTIS: описание цикла</w:t>
+      </w:r>
+      <w:r>
+        <w:t xml:space="preserve"> по обвязке (</w:t>
       </w:r>
       <w:r>
         <w:rPr>
@@ -5825,10 +5968,7 @@
         <w:t>bench/memory/README.md</w:t>
       </w:r>
       <w:r>
-        <w:t>),</w:t>
-      </w:r>
-      <w:r>
-        <w:t xml:space="preserve"> живой организационный цикл (</w:t>
+        <w:t>), живой организационный цикл (</w:t>
       </w:r>
       <w:r>
         <w:rPr>
@@ -5861,7 +6001,7 @@
         <w:pStyle w:val="1"/>
         <w:jc w:val="right"/>
       </w:pPr>
-      <w:bookmarkStart w:id="27" w:name="_Toc240988221"/>
+      <w:bookmarkStart w:id="28" w:name="_Toc240990212"/>
       <w:r>
         <w:rPr>
           <w:rFonts w:ascii="Times New Roman" w:hAnsi="Times New Roman"/>
@@ -5869,11 +6009,14 @@
         <w:lastRenderedPageBreak/>
         <w:t>Приложение А. Замер памяти на публичном наборе LongMemEval</w:t>
       </w:r>
-      <w:bookmarkEnd w:id="27"/>
+      <w:bookmarkEnd w:id="28"/>
     </w:p>
     <w:p>
       <w:r>
-        <w:t>Набор: LongMemEval, исправленная авторами версия (</w:t>
+        <w:t xml:space="preserve">Набор: LongMemEval, </w:t>
+      </w:r>
+      <w:r>
+        <w:t>исправленная авторами версия (</w:t>
       </w:r>
       <w:r>
         <w:rPr>
@@ -5883,10 +6026,7 @@
         <w:t>longmemeval-cleaned</w:t>
       </w:r>
       <w:r>
-        <w:t>), 50 вопросов из 50</w:t>
-      </w:r>
-      <w:r>
-        <w:t xml:space="preserve">0, шесть типов. Стадии: </w:t>
+        <w:t xml:space="preserve">), 50 вопросов из 500, шесть типов. Стадии: </w:t>
       </w:r>
       <w:r>
         <w:rPr>
@@ -5906,10 +6046,10 @@
         <w:t>s</w:t>
       </w:r>
       <w:r>
-        <w:t xml:space="preserve"> (полные истории, выборка ограничена 100 сессиями с обязательным сохранением сессий с ответом). Порядок вариантов одинаков на всех стадиях: ответ дают те же модели, судью п</w:t>
-      </w:r>
-      <w:r>
-        <w:t>роводят те же модели, меняется только вид памяти. Разные модели-ответчики указаны отдельно, потому что потолок зависит именно от них.</w:t>
+        <w:t xml:space="preserve"> (полные истории, выборка ограничена 100 сессиями с обязательным сохранением сессий с ответом). Порядок</w:t>
+      </w:r>
+      <w:r>
+        <w:t xml:space="preserve"> вариантов одинаков на всех стадиях: ответ дают те же модели, судью проводят те же модели, меняется только вид памяти. Разные модели-ответчики указаны отдельно, потому что потолок зависит именно от них.</w:t>
       </w:r>
     </w:p>
     <w:p>
@@ -5972,7 +6112,14 @@
                 <w:b/>
                 <w:sz w:val="24"/>
               </w:rPr>
-              <w:t>Вариант памяти</w:t>
+              <w:t xml:space="preserve">Вариант </w:t>
+            </w:r>
+            <w:r>
+              <w:rPr>
+                <w:b/>
+                <w:sz w:val="24"/>
+              </w:rPr>
+              <w:t>памяти</w:t>
             </w:r>
           </w:p>
         </w:tc>
@@ -6067,14 +6214,7 @@
                 <w:b/>
                 <w:sz w:val="24"/>
               </w:rPr>
-              <w:t xml:space="preserve">Полнота </w:t>
-            </w:r>
-            <w:r>
-              <w:rPr>
-                <w:b/>
-                <w:sz w:val="24"/>
-              </w:rPr>
-              <w:t>выборки</w:t>
+              <w:t>Полнота выборки</w:t>
             </w:r>
           </w:p>
         </w:tc>
@@ -6423,7 +6563,10 @@
         <w:t>s</w:t>
       </w:r>
       <w:r>
-        <w:t>, разбивка по типам вопросов:</w:t>
+        <w:t xml:space="preserve">, разбивка </w:t>
+      </w:r>
+      <w:r>
+        <w:t>по типам вопросов:</w:t>
       </w:r>
     </w:p>
     <w:tbl>
@@ -6832,7 +6975,13 @@
               <w:rPr>
                 <w:sz w:val="24"/>
               </w:rPr>
-              <w:t>по одному сообщению пользователя</w:t>
+              <w:t xml:space="preserve">по одному сообщению </w:t>
+            </w:r>
+            <w:r>
+              <w:rPr>
+                <w:sz w:val="24"/>
+              </w:rPr>
+              <w:t>пользователя</w:t>
             </w:r>
           </w:p>
         </w:tc>
@@ -7378,7 +7527,10 @@
     <w:p>
       <w:r>
         <w:lastRenderedPageBreak/>
-        <w:t xml:space="preserve">Оговорки, без которых эти числа цитировать нельзя. Первое: судья не вынес вердикт по 6 и 7 клеткам из 50 на стадии </w:t>
+        <w:t xml:space="preserve">Оговорки, без которых эти числа цитировать нельзя. Первое: судья не вынес вердикт по 6 и 7 клеткам </w:t>
+      </w:r>
+      <w:r>
+        <w:t xml:space="preserve">из 50 на стадии </w:t>
       </w:r>
       <w:r>
         <w:rPr>
@@ -7388,10 +7540,7 @@
         <w:t>s</w:t>
       </w:r>
       <w:r>
-        <w:t>; такие клетки не засчитаны ни как верные, ни как нев</w:t>
-      </w:r>
-      <w:r>
-        <w:t xml:space="preserve">ерные, и в таблице они вынесены отдельным столбцом. Второе: вопросы о предпочтениях дали ноль на всех вариантах в прогоне </w:t>
+        <w:t xml:space="preserve">; такие клетки не засчитаны ни как верные, ни как неверные, и в таблице они вынесены отдельным столбцом. Второе: вопросы о предпочтениях дали ноль на всех вариантах в прогоне </w:t>
       </w:r>
       <w:r>
         <w:rPr>
@@ -7401,10 +7550,10 @@
         <w:t>oracle-50-1</w:t>
       </w:r>
       <w:r>
-        <w:t>, то есть этот тип вопросов нашим стендом пока не измеряется. Третье: замер не финальный, разница между графом и плоским жу</w:t>
-      </w:r>
-      <w:r>
-        <w:t>рналом лежит внутри шума, и именно поэтому в основном тексте не делается вывода о превосходстве графа.</w:t>
+        <w:t>, то есть этот тип вопросов нашим стендом пока не изм</w:t>
+      </w:r>
+      <w:r>
+        <w:t>еряется. Третье: замер не финальный, разница между графом и плоским журналом лежит внутри шума, и именно поэтому в основном тексте не делается вывода о превосходстве графа.</w:t>
       </w:r>
     </w:p>
     <w:p>
@@ -7417,7 +7566,7 @@
         <w:pStyle w:val="1"/>
         <w:jc w:val="right"/>
       </w:pPr>
-      <w:bookmarkStart w:id="28" w:name="_Toc240988222"/>
+      <w:bookmarkStart w:id="29" w:name="_Toc240990213"/>
       <w:r>
         <w:rPr>
           <w:rFonts w:ascii="Times New Roman" w:hAnsi="Times New Roman"/>
@@ -7425,7 +7574,7 @@
         <w:lastRenderedPageBreak/>
         <w:t>Приложение Б. Раунды поиска по обвязке</w:t>
       </w:r>
-      <w:bookmarkEnd w:id="28"/>
+      <w:bookmarkEnd w:id="29"/>
     </w:p>
     <w:tbl>
       <w:tblPr>
@@ -7665,13 +7814,7 @@
               <w:rPr>
                 <w:sz w:val="24"/>
               </w:rPr>
-              <w:t xml:space="preserve">развёрнуто, в рабочем режиме +27,0 процента </w:t>
-            </w:r>
-            <w:r>
-              <w:rPr>
-                <w:sz w:val="24"/>
-              </w:rPr>
-              <w:t>(хуже)</w:t>
+              <w:t>развёрнуто, в рабочем режиме +27,0 процента (хуже)</w:t>
             </w:r>
           </w:p>
         </w:tc>
@@ -7967,7 +8110,13 @@
               <w:rPr>
                 <w:sz w:val="24"/>
               </w:rPr>
-              <w:t>измерено и отклонено (прогноз +32,0, измерение +1,5)</w:t>
+              <w:t xml:space="preserve">измерено и отклонено (прогноз </w:t>
+            </w:r>
+            <w:r>
+              <w:rPr>
+                <w:sz w:val="24"/>
+              </w:rPr>
+              <w:t>+32,0, измерение +1,5)</w:t>
             </w:r>
           </w:p>
         </w:tc>
@@ -8041,13 +8190,7 @@
               <w:rPr>
                 <w:sz w:val="24"/>
               </w:rPr>
-              <w:t xml:space="preserve">развёрнуто по одному прогону (минус 3,4), при </w:t>
-            </w:r>
-            <w:r>
-              <w:rPr>
-                <w:sz w:val="24"/>
-              </w:rPr>
-              <w:t>трёх прогонах +4,0</w:t>
+              <w:t>развёрнуто по одному прогону (минус 3,4), при трёх прогонах +4,0</w:t>
             </w:r>
           </w:p>
         </w:tc>
@@ -8212,7 +8355,7 @@
         <w:pStyle w:val="1"/>
         <w:jc w:val="right"/>
       </w:pPr>
-      <w:bookmarkStart w:id="29" w:name="_Toc240988223"/>
+      <w:bookmarkStart w:id="30" w:name="_Toc240990214"/>
       <w:r>
         <w:rPr>
           <w:rFonts w:ascii="Times New Roman" w:hAnsi="Times New Roman"/>
@@ -8220,14 +8363,14 @@
         <w:lastRenderedPageBreak/>
         <w:t>Приложение В. Как проверить числа работы</w:t>
       </w:r>
-      <w:bookmarkEnd w:id="29"/>
+      <w:bookmarkEnd w:id="30"/>
     </w:p>
     <w:p>
       <w:r>
-        <w:t>Все числа основного текста берутся из артефактов, которые создаются запуском кода проекта.</w:t>
-      </w:r>
-      <w:r>
-        <w:t xml:space="preserve"> Пути указаны относительно каталога проекта.</w:t>
+        <w:t xml:space="preserve">Все числа </w:t>
+      </w:r>
+      <w:r>
+        <w:t>основного текста берутся из артефактов, которые создаются запуском кода проекта. Пути указаны относительно каталога проекта.</w:t>
       </w:r>
     </w:p>
     <w:tbl>
@@ -8318,7 +8461,13 @@
               <w:rPr>
                 <w:sz w:val="24"/>
               </w:rPr>
-              <w:t>docs/series.md и docs/results.md (создаются прогоном серии по зёрнам)</w:t>
+              <w:t>docs/series.md и docs/results.md (создаются прогоном серии по зё</w:t>
+            </w:r>
+            <w:r>
+              <w:rPr>
+                <w:sz w:val="24"/>
+              </w:rPr>
+              <w:t>рнам)</w:t>
             </w:r>
           </w:p>
         </w:tc>
@@ -8356,13 +8505,7 @@
               <w:rPr>
                 <w:sz w:val="24"/>
               </w:rPr>
-              <w:t xml:space="preserve">python -m </w:t>
-            </w:r>
-            <w:r>
-              <w:rPr>
-                <w:sz w:val="24"/>
-              </w:rPr>
-              <w:t>metrics.build_table против живого стека</w:t>
+              <w:t>python -m metrics.build_table против живого стека</w:t>
             </w:r>
           </w:p>
         </w:tc>
@@ -8438,13 +8581,7 @@
               <w:rPr>
                 <w:sz w:val="24"/>
               </w:rPr>
-              <w:t>python harness/rsi.py --show --recheck --ledger; записи в harness/l</w:t>
-            </w:r>
-            <w:r>
-              <w:rPr>
-                <w:sz w:val="24"/>
-              </w:rPr>
-              <w:t>ab/rsi/round-*.json</w:t>
+              <w:t>python harness/rsi.py --show --recheck --ledger; записи в harness/lab/rsi/round-*.json</w:t>
             </w:r>
           </w:p>
         </w:tc>
@@ -8520,7 +8657,13 @@
               <w:rPr>
                 <w:sz w:val="24"/>
               </w:rPr>
-              <w:t>python python/life_loop.py --cycles 2; лента на панели, раздел организации</w:t>
+              <w:t xml:space="preserve">python </w:t>
+            </w:r>
+            <w:r>
+              <w:rPr>
+                <w:sz w:val="24"/>
+              </w:rPr>
+              <w:t>python/life_loop.py --cycles 2; лента на панели, раздел организации</w:t>
             </w:r>
           </w:p>
         </w:tc>
@@ -8540,13 +8683,7 @@
               <w:rPr>
                 <w:sz w:val="24"/>
               </w:rPr>
-              <w:t xml:space="preserve">Отсутствие </w:t>
-            </w:r>
-            <w:r>
-              <w:rPr>
-                <w:sz w:val="24"/>
-              </w:rPr>
-              <w:t>исполнений в повторе</w:t>
+              <w:t>Отсутствие исполнений в повторе</w:t>
             </w:r>
           </w:p>
         </w:tc>
@@ -8602,13 +8739,13 @@
               <w:rPr>
                 <w:sz w:val="24"/>
               </w:rPr>
-              <w:t xml:space="preserve">python -m pytest tests -q --ignore=tests/test_core_loop.py и python -m pytest harness/tests </w:t>
-            </w:r>
-            <w:r>
-              <w:rPr>
-                <w:sz w:val="24"/>
-              </w:rPr>
-              <w:t>-q: 109 и 19 проверок, все проходят без обращения к сети</w:t>
+              <w:t>python -m py</w:t>
+            </w:r>
+            <w:r>
+              <w:rPr>
+                <w:sz w:val="24"/>
+              </w:rPr>
+              <w:t>test tests -q --ignore=tests/test_core_loop.py и python -m pytest harness/tests -q: 109 и 19 проверок, все проходят без обращения к сети</w:t>
             </w:r>
           </w:p>
         </w:tc>
@@ -8625,7 +8762,7 @@
         <w:pStyle w:val="1"/>
         <w:jc w:val="right"/>
       </w:pPr>
-      <w:bookmarkStart w:id="30" w:name="_Toc240988224"/>
+      <w:bookmarkStart w:id="31" w:name="_Toc240990215"/>
       <w:r>
         <w:rPr>
           <w:rFonts w:ascii="Times New Roman" w:hAnsi="Times New Roman"/>
@@ -8633,7 +8770,7 @@
         <w:lastRenderedPageBreak/>
         <w:t>Приложение Г. Рисунки панели управления</w:t>
       </w:r>
-      <w:bookmarkEnd w:id="30"/>
+      <w:bookmarkEnd w:id="31"/>
     </w:p>
     <w:p>
       <w:pPr>
@@ -8685,7 +8822,10 @@
     </w:p>
     <w:p>
       <w:r>
-        <w:t>Рисунок Г.1. Общий вид панели: состояние цикла, управление этапами, показатели.</w:t>
+        <w:t xml:space="preserve">Рисунок Г.1. Общий вид панели: состояние цикла, управление этапами, </w:t>
+      </w:r>
+      <w:r>
+        <w:t>показатели.</w:t>
       </w:r>
     </w:p>
     <w:p>
@@ -8738,10 +8878,7 @@
     </w:p>
     <w:p>
       <w:r>
-        <w:t xml:space="preserve">Рисунок Г.2. Лента организации: предложения исследователя, решение </w:t>
-      </w:r>
-      <w:r>
-        <w:t>менеджера, созданные рабочие копии, пакеты изменений и причины остановок.</w:t>
+        <w:t>Рисунок Г.2. Лента организации: предложения исследователя, решение менеджера, созданные рабочие копии, пакеты изменений и причины остановок.</w:t>
       </w:r>
     </w:p>
     <w:p>
@@ -8848,10 +8985,7 @@
     </w:p>
     <w:p>
       <w:r>
-        <w:t>Рисунок Г.4. Раздел «что здесь доказывается»: перечень утверждений, подтверждён</w:t>
-      </w:r>
-      <w:r>
-        <w:t>ных текущим прогоном, отдельно от утверждений, которые ещё не подтверждены.</w:t>
+        <w:t>Рисунок Г.4. Раздел «что здесь доказывается»: перечень утверждений, подтверждённых текущим прогоном, отдельно от утверждений, которые ещё не подтверждены.</w:t>
       </w:r>
     </w:p>
     <w:p>
@@ -8866,10 +9000,13 @@
         <w:t>scripts/pz-shots.py</w:t>
       </w:r>
       <w:r>
-        <w:t>, поэтому их можно пересобрать заново, когда панель изменится. Рисунок роста счёта в мире в работу не включ</w:t>
-      </w:r>
-      <w:r>
-        <w:t>ён: на момент съёмки он показывал пустое состояние, потому что панель ищет эпизоды деплоя в графе и не находит их там, где они записаны. Это дефект панели, а не отсутствие данных: сами раунды приведены таблицей в приложении Б.</w:t>
+        <w:t>, поэтому их можно пересоб</w:t>
+      </w:r>
+      <w:r>
+        <w:t>рать заново, когда панель изменится. Рисунок роста счёта в мире в работу не включён: на момент съёмки он показывал пустое состояние, потому что панель ищет эпизоды деплоя в графе и не находит их там, где они записаны. Это дефект панели, а не отсутствие дан</w:t>
+      </w:r>
+      <w:r>
+        <w:t>ных: сами раунды приведены таблицей в приложении Б.</w:t>
       </w:r>
     </w:p>
     <w:sectPr>
@@ -20561,7 +20698,7 @@
     <w:autoRedefine/>
     <w:uiPriority w:val="39"/>
     <w:unhideWhenUsed/>
-    <w:rsid w:val="005D595A"/>
+    <w:rsid w:val="001F2792"/>
     <w:pPr>
       <w:spacing w:after="100"/>
     </w:pPr>
@@ -20573,7 +20710,7 @@
     <w:autoRedefine/>
     <w:uiPriority w:val="39"/>
     <w:unhideWhenUsed/>
-    <w:rsid w:val="005D595A"/>
+    <w:rsid w:val="001F2792"/>
     <w:pPr>
       <w:spacing w:after="100"/>
       <w:ind w:left="280"/>
@@ -20584,7 +20721,7 @@
     <w:basedOn w:val="a2"/>
     <w:uiPriority w:val="99"/>
     <w:unhideWhenUsed/>
-    <w:rsid w:val="005D595A"/>
+    <w:rsid w:val="001F2792"/>
     <w:rPr>
       <w:color w:val="0000FF" w:themeColor="hyperlink"/>
       <w:u w:val="single"/>
@@ -20918,7 +21055,7 @@
 </file>
 
 <file path=customXml/itemProps1.xml><?xml version="1.0" encoding="utf-8"?>
-<ds:datastoreItem xmlns:ds="http://schemas.openxmlformats.org/officeDocument/2006/customXml" ds:itemID="{0112E5CF-A73F-40ED-8A0F-3CB88CE8BEED}">
+<ds:datastoreItem xmlns:ds="http://schemas.openxmlformats.org/officeDocument/2006/customXml" ds:itemID="{E0C9C15D-1AFB-4AD9-A319-6EDB4C5FD832}">
   <ds:schemaRefs>
     <ds:schemaRef ds:uri="http://schemas.openxmlformats.org/officeDocument/2006/bibliography"/>
   </ds:schemaRefs>

</xml_diff>